<commit_message>
fix: aplicar formatação Tahoma negrito nos valores do relatório DOCX
Valores dos campos agora em Tahoma bold sz=20 (igual ao documento de referência).
CPF e Capital Social em vermelho (#EE0000). Labels permanecem em Times New Roman normal.

Co-Authored-By: Claude Sonnet 4.6 <noreply@anthropic.com>
</commit_message>
<xml_diff>
--- a/public/relatorio_template.docx
+++ b/public/relatorio_template.docx
@@ -83,7 +83,17 @@
                                 <w:rPr>
                                   <w:rFonts w:ascii="Times New Roman" w:hAnsi="Times New Roman" w:cs="Times New Roman"/>
                                 </w:rPr>
-                                <w:t xml:space="preserve">CNPJ: {CNPJ}</w:t>
+                                <w:t xml:space="preserve">CNPJ: </w:t>
+                              </w:r>
+                              <w:r>
+                                <w:rPr>
+                                  <w:rFonts w:ascii="Tahoma" w:hAnsi="Tahoma" w:cs="Tahoma"/>
+                                  <w:b/>
+                                  <w:bCs/>
+                                  <w:sz w:val="20"/>
+                                  <w:szCs w:val="20"/>
+                                </w:rPr>
+                                <w:t>{CNPJ}</w:t>
                               </w:r>
                             </w:p>
                             <w:p>
@@ -143,7 +153,17 @@
                                   <w:rFonts w:ascii="Times New Roman" w:hAnsi="Times New Roman" w:cs="Times New Roman"/>
                                   <w:lang w:val="pt-BR"/>
                                 </w:rPr>
-                                <w:t xml:space="preserve">INSCRIÇÃO MUNICIPAL: {INSC_MUN}</w:t>
+                                <w:t xml:space="preserve">INSCRIÇÃO MUNICIPAL: </w:t>
+                              </w:r>
+                              <w:r>
+                                <w:rPr>
+                                  <w:rFonts w:ascii="Tahoma" w:hAnsi="Tahoma" w:cs="Tahoma"/>
+                                  <w:b/>
+                                  <w:bCs/>
+                                  <w:sz w:val="20"/>
+                                  <w:szCs w:val="20"/>
+                                </w:rPr>
+                                <w:t>{INSC_MUN}</w:t>
                               </w:r>
                             </w:p>
                             <w:p>
@@ -203,7 +223,17 @@
                                   <w:rFonts w:ascii="Times New Roman" w:hAnsi="Times New Roman" w:cs="Times New Roman"/>
                                   <w:lang w:val="pt-BR"/>
                                 </w:rPr>
-                                <w:t xml:space="preserve">INSCRIÇÃO ESTADUAL: {INSC_EST}</w:t>
+                                <w:t xml:space="preserve">INSCRIÇÃO ESTADUAL: </w:t>
+                              </w:r>
+                              <w:r>
+                                <w:rPr>
+                                  <w:rFonts w:ascii="Tahoma" w:hAnsi="Tahoma" w:cs="Tahoma"/>
+                                  <w:b/>
+                                  <w:bCs/>
+                                  <w:sz w:val="20"/>
+                                  <w:szCs w:val="20"/>
+                                </w:rPr>
+                                <w:t>{INSC_EST}</w:t>
                               </w:r>
                             </w:p>
                             <w:p>
@@ -270,7 +300,18 @@
                                   <w:rFonts w:ascii="Times New Roman" w:hAnsi="Times New Roman" w:cs="Times New Roman"/>
                                   <w:lang w:val="pt-BR"/>
                                 </w:rPr>
-                                <w:t xml:space="preserve">: {CPF}</w:t>
+                                <w:t xml:space="preserve">: </w:t>
+                              </w:r>
+                              <w:r>
+                                <w:rPr>
+                                  <w:rFonts w:ascii="Tahoma" w:hAnsi="Tahoma" w:cs="Tahoma"/>
+                                  <w:b/>
+                                  <w:bCs/>
+                                  <w:color w:val="EE0000"/>
+                                  <w:sz w:val="20"/>
+                                  <w:szCs w:val="20"/>
+                                </w:rPr>
+                                <w:t>{CPF}</w:t>
                               </w:r>
                             </w:p>
                             <w:p>
@@ -338,7 +379,17 @@
                                   <w:rFonts w:ascii="Times New Roman" w:hAnsi="Times New Roman" w:cs="Times New Roman"/>
                                   <w:lang w:val="pt-BR"/>
                                 </w:rPr>
-                                <w:t xml:space="preserve">: {DONO}</w:t>
+                                <w:t xml:space="preserve">: </w:t>
+                              </w:r>
+                              <w:r>
+                                <w:rPr>
+                                  <w:rFonts w:ascii="Tahoma" w:hAnsi="Tahoma" w:cs="Tahoma"/>
+                                  <w:b/>
+                                  <w:bCs/>
+                                  <w:sz w:val="20"/>
+                                  <w:szCs w:val="20"/>
+                                </w:rPr>
+                                <w:t>{DONO}</w:t>
                               </w:r>
                             </w:p>
                             <w:p>
@@ -398,7 +449,17 @@
                                   <w:rFonts w:ascii="Times New Roman" w:hAnsi="Times New Roman" w:cs="Times New Roman"/>
                                   <w:lang w:val="pt-BR"/>
                                 </w:rPr>
-                                <w:t xml:space="preserve">SÓCIO ADMINISTRADOR: {SOCIO}</w:t>
+                                <w:t xml:space="preserve">SÓCIO ADMINISTRADOR: </w:t>
+                              </w:r>
+                              <w:r>
+                                <w:rPr>
+                                  <w:rFonts w:ascii="Tahoma" w:hAnsi="Tahoma" w:cs="Tahoma"/>
+                                  <w:b/>
+                                  <w:bCs/>
+                                  <w:sz w:val="20"/>
+                                  <w:szCs w:val="20"/>
+                                </w:rPr>
+                                <w:t>{SOCIO}</w:t>
                               </w:r>
                             </w:p>
                             <w:p>
@@ -465,7 +526,17 @@
                                   <w:rFonts w:ascii="Times New Roman" w:hAnsi="Times New Roman" w:cs="Times New Roman"/>
                                   <w:lang w:val="pt-BR"/>
                                 </w:rPr>
-                                <w:t xml:space="preserve">: {NIRE}</w:t>
+                                <w:t xml:space="preserve">: </w:t>
+                              </w:r>
+                              <w:r>
+                                <w:rPr>
+                                  <w:rFonts w:ascii="Tahoma" w:hAnsi="Tahoma" w:cs="Tahoma"/>
+                                  <w:b/>
+                                  <w:bCs/>
+                                  <w:sz w:val="20"/>
+                                  <w:szCs w:val="20"/>
+                                </w:rPr>
+                                <w:t>{NIRE}</w:t>
                               </w:r>
                             </w:p>
                             <w:p>
@@ -627,7 +698,17 @@
                                   <w:rFonts w:ascii="Times New Roman" w:hAnsi="Times New Roman" w:cs="Times New Roman"/>
                                   <w:lang w:val="pt-BR"/>
                                 </w:rPr>
-                                <w:t xml:space="preserve">: {RAZAO}</w:t>
+                                <w:t xml:space="preserve">: </w:t>
+                              </w:r>
+                              <w:r>
+                                <w:rPr>
+                                  <w:rFonts w:ascii="Tahoma" w:hAnsi="Tahoma" w:cs="Tahoma"/>
+                                  <w:b/>
+                                  <w:bCs/>
+                                  <w:sz w:val="20"/>
+                                  <w:szCs w:val="20"/>
+                                </w:rPr>
+                                <w:t>{RAZAO}</w:t>
                               </w:r>
                             </w:p>
                             <w:p>
@@ -691,7 +772,17 @@
                                   <w:szCs w:val="20"/>
                                   <w:lang w:val="pt-BR"/>
                                 </w:rPr>
-                                <w:t xml:space="preserve">MUNICÍPIO / ESTADO: {MUN_EST}</w:t>
+                                <w:t xml:space="preserve">MUNICÍPIO / ESTADO: </w:t>
+                              </w:r>
+                              <w:r>
+                                <w:rPr>
+                                  <w:rFonts w:ascii="Tahoma" w:hAnsi="Tahoma" w:cs="Tahoma"/>
+                                  <w:b/>
+                                  <w:bCs/>
+                                  <w:sz w:val="20"/>
+                                  <w:szCs w:val="20"/>
+                                </w:rPr>
+                                <w:t>{MUN_EST}</w:t>
                               </w:r>
                             </w:p>
                             <w:p>
@@ -758,7 +849,17 @@
                                   <w:rFonts w:ascii="Times New Roman" w:hAnsi="Times New Roman" w:cs="Times New Roman"/>
                                   <w:lang w:val="pt-BR"/>
                                 </w:rPr>
-                                <w:t xml:space="preserve">: {ABERTURA}</w:t>
+                                <w:t xml:space="preserve">: </w:t>
+                              </w:r>
+                              <w:r>
+                                <w:rPr>
+                                  <w:rFonts w:ascii="Tahoma" w:hAnsi="Tahoma" w:cs="Tahoma"/>
+                                  <w:b/>
+                                  <w:bCs/>
+                                  <w:sz w:val="20"/>
+                                  <w:szCs w:val="20"/>
+                                </w:rPr>
+                                <w:t>{ABERTURA}</w:t>
                               </w:r>
                             </w:p>
                             <w:p>
@@ -822,7 +923,18 @@
                                   <w:szCs w:val="20"/>
                                   <w:lang w:val="pt-BR"/>
                                 </w:rPr>
-                                <w:t xml:space="preserve">CAPITAL SOCIAL: {CAPITAL}</w:t>
+                                <w:t xml:space="preserve">CAPITAL SOCIAL: </w:t>
+                              </w:r>
+                              <w:r>
+                                <w:rPr>
+                                  <w:rFonts w:ascii="Tahoma" w:hAnsi="Tahoma" w:cs="Tahoma"/>
+                                  <w:b/>
+                                  <w:bCs/>
+                                  <w:color w:val="EE0000"/>
+                                  <w:sz w:val="20"/>
+                                  <w:szCs w:val="20"/>
+                                </w:rPr>
+                                <w:t>{CAPITAL}</w:t>
                               </w:r>
                             </w:p>
                             <w:p>
@@ -876,7 +988,17 @@
                           <w:rPr>
                             <w:rFonts w:ascii="Times New Roman" w:hAnsi="Times New Roman" w:cs="Times New Roman"/>
                           </w:rPr>
-                          <w:t xml:space="preserve">CNPJ: {CNPJ}</w:t>
+                          <w:t xml:space="preserve">CNPJ: </w:t>
+                        </w:r>
+                        <w:r>
+                          <w:rPr>
+                            <w:rFonts w:ascii="Tahoma" w:hAnsi="Tahoma" w:cs="Tahoma"/>
+                            <w:b/>
+                            <w:bCs/>
+                            <w:sz w:val="20"/>
+                            <w:szCs w:val="20"/>
+                          </w:rPr>
+                          <w:t>{CNPJ}</w:t>
                         </w:r>
                       </w:p>
                       <w:p>
@@ -909,7 +1031,17 @@
                             <w:rFonts w:ascii="Times New Roman" w:hAnsi="Times New Roman" w:cs="Times New Roman"/>
                             <w:lang w:val="pt-BR"/>
                           </w:rPr>
-                          <w:t xml:space="preserve">INSCRIÇÃO MUNICIPAL: {INSC_MUN}</w:t>
+                          <w:t xml:space="preserve">INSCRIÇÃO MUNICIPAL: </w:t>
+                        </w:r>
+                        <w:r>
+                          <w:rPr>
+                            <w:rFonts w:ascii="Tahoma" w:hAnsi="Tahoma" w:cs="Tahoma"/>
+                            <w:b/>
+                            <w:bCs/>
+                            <w:sz w:val="20"/>
+                            <w:szCs w:val="20"/>
+                          </w:rPr>
+                          <w:t>{INSC_MUN}</w:t>
                         </w:r>
                       </w:p>
                       <w:p>
@@ -942,7 +1074,17 @@
                             <w:rFonts w:ascii="Times New Roman" w:hAnsi="Times New Roman" w:cs="Times New Roman"/>
                             <w:lang w:val="pt-BR"/>
                           </w:rPr>
-                          <w:t xml:space="preserve">INSCRIÇÃO ESTADUAL: {INSC_EST}</w:t>
+                          <w:t xml:space="preserve">INSCRIÇÃO ESTADUAL: </w:t>
+                        </w:r>
+                        <w:r>
+                          <w:rPr>
+                            <w:rFonts w:ascii="Tahoma" w:hAnsi="Tahoma" w:cs="Tahoma"/>
+                            <w:b/>
+                            <w:bCs/>
+                            <w:sz w:val="20"/>
+                            <w:szCs w:val="20"/>
+                          </w:rPr>
+                          <w:t>{INSC_EST}</w:t>
                         </w:r>
                       </w:p>
                       <w:p>
@@ -982,7 +1124,18 @@
                             <w:rFonts w:ascii="Times New Roman" w:hAnsi="Times New Roman" w:cs="Times New Roman"/>
                             <w:lang w:val="pt-BR"/>
                           </w:rPr>
-                          <w:t xml:space="preserve">: {CPF}</w:t>
+                          <w:t xml:space="preserve">: </w:t>
+                        </w:r>
+                        <w:r>
+                          <w:rPr>
+                            <w:rFonts w:ascii="Tahoma" w:hAnsi="Tahoma" w:cs="Tahoma"/>
+                            <w:b/>
+                            <w:bCs/>
+                            <w:color w:val="EE0000"/>
+                            <w:sz w:val="20"/>
+                            <w:szCs w:val="20"/>
+                          </w:rPr>
+                          <w:t>{CPF}</w:t>
                         </w:r>
                       </w:p>
                       <w:p>
@@ -1023,7 +1176,17 @@
                             <w:rFonts w:ascii="Times New Roman" w:hAnsi="Times New Roman" w:cs="Times New Roman"/>
                             <w:lang w:val="pt-BR"/>
                           </w:rPr>
-                          <w:t xml:space="preserve">: {DONO}</w:t>
+                          <w:t xml:space="preserve">: </w:t>
+                        </w:r>
+                        <w:r>
+                          <w:rPr>
+                            <w:rFonts w:ascii="Tahoma" w:hAnsi="Tahoma" w:cs="Tahoma"/>
+                            <w:b/>
+                            <w:bCs/>
+                            <w:sz w:val="20"/>
+                            <w:szCs w:val="20"/>
+                          </w:rPr>
+                          <w:t>{DONO}</w:t>
                         </w:r>
                       </w:p>
                       <w:p>
@@ -1056,7 +1219,17 @@
                             <w:rFonts w:ascii="Times New Roman" w:hAnsi="Times New Roman" w:cs="Times New Roman"/>
                             <w:lang w:val="pt-BR"/>
                           </w:rPr>
-                          <w:t xml:space="preserve">SÓCIO ADMINISTRADOR: {SOCIO}</w:t>
+                          <w:t xml:space="preserve">SÓCIO ADMINISTRADOR: </w:t>
+                        </w:r>
+                        <w:r>
+                          <w:rPr>
+                            <w:rFonts w:ascii="Tahoma" w:hAnsi="Tahoma" w:cs="Tahoma"/>
+                            <w:b/>
+                            <w:bCs/>
+                            <w:sz w:val="20"/>
+                            <w:szCs w:val="20"/>
+                          </w:rPr>
+                          <w:t>{SOCIO}</w:t>
                         </w:r>
                       </w:p>
                       <w:p>
@@ -1096,7 +1269,17 @@
                             <w:rFonts w:ascii="Times New Roman" w:hAnsi="Times New Roman" w:cs="Times New Roman"/>
                             <w:lang w:val="pt-BR"/>
                           </w:rPr>
-                          <w:t xml:space="preserve">: {NIRE}</w:t>
+                          <w:t xml:space="preserve">: </w:t>
+                        </w:r>
+                        <w:r>
+                          <w:rPr>
+                            <w:rFonts w:ascii="Tahoma" w:hAnsi="Tahoma" w:cs="Tahoma"/>
+                            <w:b/>
+                            <w:bCs/>
+                            <w:sz w:val="20"/>
+                            <w:szCs w:val="20"/>
+                          </w:rPr>
+                          <w:t>{NIRE}</w:t>
                         </w:r>
                       </w:p>
                       <w:p>
@@ -1204,7 +1387,17 @@
                             <w:rFonts w:ascii="Times New Roman" w:hAnsi="Times New Roman" w:cs="Times New Roman"/>
                             <w:lang w:val="pt-BR"/>
                           </w:rPr>
-                          <w:t xml:space="preserve">: {RAZAO}</w:t>
+                          <w:t xml:space="preserve">: </w:t>
+                        </w:r>
+                        <w:r>
+                          <w:rPr>
+                            <w:rFonts w:ascii="Tahoma" w:hAnsi="Tahoma" w:cs="Tahoma"/>
+                            <w:b/>
+                            <w:bCs/>
+                            <w:sz w:val="20"/>
+                            <w:szCs w:val="20"/>
+                          </w:rPr>
+                          <w:t>{RAZAO}</w:t>
                         </w:r>
                       </w:p>
                       <w:p>
@@ -1241,7 +1434,17 @@
                             <w:szCs w:val="20"/>
                             <w:lang w:val="pt-BR"/>
                           </w:rPr>
-                          <w:t xml:space="preserve">MUNICÍPIO / ESTADO: {MUN_EST}</w:t>
+                          <w:t xml:space="preserve">MUNICÍPIO / ESTADO: </w:t>
+                        </w:r>
+                        <w:r>
+                          <w:rPr>
+                            <w:rFonts w:ascii="Tahoma" w:hAnsi="Tahoma" w:cs="Tahoma"/>
+                            <w:b/>
+                            <w:bCs/>
+                            <w:sz w:val="20"/>
+                            <w:szCs w:val="20"/>
+                          </w:rPr>
+                          <w:t>{MUN_EST}</w:t>
                         </w:r>
                       </w:p>
                       <w:p>
@@ -1281,7 +1484,17 @@
                             <w:rFonts w:ascii="Times New Roman" w:hAnsi="Times New Roman" w:cs="Times New Roman"/>
                             <w:lang w:val="pt-BR"/>
                           </w:rPr>
-                          <w:t xml:space="preserve">: {ABERTURA}</w:t>
+                          <w:t xml:space="preserve">: </w:t>
+                        </w:r>
+                        <w:r>
+                          <w:rPr>
+                            <w:rFonts w:ascii="Tahoma" w:hAnsi="Tahoma" w:cs="Tahoma"/>
+                            <w:b/>
+                            <w:bCs/>
+                            <w:sz w:val="20"/>
+                            <w:szCs w:val="20"/>
+                          </w:rPr>
+                          <w:t>{ABERTURA}</w:t>
                         </w:r>
                       </w:p>
                       <w:p>
@@ -1318,7 +1531,18 @@
                             <w:szCs w:val="20"/>
                             <w:lang w:val="pt-BR"/>
                           </w:rPr>
-                          <w:t xml:space="preserve">CAPITAL SOCIAL: {CAPITAL}</w:t>
+                          <w:t xml:space="preserve">CAPITAL SOCIAL: </w:t>
+                        </w:r>
+                        <w:r>
+                          <w:rPr>
+                            <w:rFonts w:ascii="Tahoma" w:hAnsi="Tahoma" w:cs="Tahoma"/>
+                            <w:b/>
+                            <w:bCs/>
+                            <w:color w:val="EE0000"/>
+                            <w:sz w:val="20"/>
+                            <w:szCs w:val="20"/>
+                          </w:rPr>
+                          <w:t>{CAPITAL}</w:t>
                         </w:r>
                       </w:p>
                       <w:p>
@@ -1539,7 +1763,17 @@
                                   <w:rFonts w:ascii="Times New Roman" w:hAnsi="Times New Roman" w:cs="Times New Roman"/>
                                   <w:lang w:val="pt-BR"/>
                                 </w:rPr>
-                                <w:t xml:space="preserve">: {NFSE1}</w:t>
+                                <w:t xml:space="preserve">: </w:t>
+                              </w:r>
+                              <w:r>
+                                <w:rPr>
+                                  <w:rFonts w:ascii="Tahoma" w:hAnsi="Tahoma" w:cs="Tahoma"/>
+                                  <w:b/>
+                                  <w:bCs/>
+                                  <w:sz w:val="20"/>
+                                  <w:szCs w:val="20"/>
+                                </w:rPr>
+                                <w:t>{NFSE1}</w:t>
                               </w:r>
                             </w:p>
                             <w:p>
@@ -1659,7 +1893,17 @@
                                   <w:rFonts w:ascii="Times New Roman" w:hAnsi="Times New Roman" w:cs="Times New Roman"/>
                                   <w:lang w:val="pt-BR"/>
                                 </w:rPr>
-                                <w:t xml:space="preserve">ESTADO: {SEN_EST}</w:t>
+                                <w:t xml:space="preserve">ESTADO: </w:t>
+                              </w:r>
+                              <w:r>
+                                <w:rPr>
+                                  <w:rFonts w:ascii="Tahoma" w:hAnsi="Tahoma" w:cs="Tahoma"/>
+                                  <w:b/>
+                                  <w:bCs/>
+                                  <w:sz w:val="20"/>
+                                  <w:szCs w:val="20"/>
+                                </w:rPr>
+                                <w:t>{SEN_EST}</w:t>
                               </w:r>
                             </w:p>
                             <w:p>
@@ -1719,7 +1963,17 @@
                                   <w:rFonts w:ascii="Times New Roman" w:hAnsi="Times New Roman" w:cs="Times New Roman"/>
                                   <w:lang w:val="pt-BR"/>
                                 </w:rPr>
-                                <w:t xml:space="preserve">SEGMENTO: {SEGMENTO}</w:t>
+                                <w:t xml:space="preserve">SEGMENTO: </w:t>
+                              </w:r>
+                              <w:r>
+                                <w:rPr>
+                                  <w:rFonts w:ascii="Tahoma" w:hAnsi="Tahoma" w:cs="Tahoma"/>
+                                  <w:b/>
+                                  <w:bCs/>
+                                  <w:sz w:val="20"/>
+                                  <w:szCs w:val="20"/>
+                                </w:rPr>
+                                <w:t>{SEGMENTO}</w:t>
                               </w:r>
                             </w:p>
                             <w:p>
@@ -2422,7 +2676,17 @@
                                   <w:rFonts w:ascii="Times New Roman" w:hAnsi="Times New Roman" w:cs="Times New Roman"/>
                                   <w:lang w:val="pt-BR"/>
                                 </w:rPr>
-                                <w:t xml:space="preserve">NFS-e: {NFSE2}</w:t>
+                                <w:t xml:space="preserve">NFS-e: </w:t>
+                              </w:r>
+                              <w:r>
+                                <w:rPr>
+                                  <w:rFonts w:ascii="Tahoma" w:hAnsi="Tahoma" w:cs="Tahoma"/>
+                                  <w:b/>
+                                  <w:bCs/>
+                                  <w:sz w:val="20"/>
+                                  <w:szCs w:val="20"/>
+                                </w:rPr>
+                                <w:t>{NFSE2}</w:t>
                               </w:r>
                             </w:p>
                             <w:p>
@@ -2528,7 +2792,17 @@
                             <w:rFonts w:ascii="Times New Roman" w:hAnsi="Times New Roman" w:cs="Times New Roman"/>
                             <w:lang w:val="pt-BR"/>
                           </w:rPr>
-                          <w:t xml:space="preserve">: {NFSE1}</w:t>
+                          <w:t xml:space="preserve">: </w:t>
+                        </w:r>
+                        <w:r>
+                          <w:rPr>
+                            <w:rFonts w:ascii="Tahoma" w:hAnsi="Tahoma" w:cs="Tahoma"/>
+                            <w:b/>
+                            <w:bCs/>
+                            <w:sz w:val="20"/>
+                            <w:szCs w:val="20"/>
+                          </w:rPr>
+                          <w:t>{NFSE1}</w:t>
                         </w:r>
                       </w:p>
                       <w:p>
@@ -2594,7 +2868,17 @@
                             <w:rFonts w:ascii="Times New Roman" w:hAnsi="Times New Roman" w:cs="Times New Roman"/>
                             <w:lang w:val="pt-BR"/>
                           </w:rPr>
-                          <w:t xml:space="preserve">ESTADO: {SEN_EST}</w:t>
+                          <w:t xml:space="preserve">ESTADO: </w:t>
+                        </w:r>
+                        <w:r>
+                          <w:rPr>
+                            <w:rFonts w:ascii="Tahoma" w:hAnsi="Tahoma" w:cs="Tahoma"/>
+                            <w:b/>
+                            <w:bCs/>
+                            <w:sz w:val="20"/>
+                            <w:szCs w:val="20"/>
+                          </w:rPr>
+                          <w:t>{SEN_EST}</w:t>
                         </w:r>
                       </w:p>
                       <w:p>
@@ -2627,7 +2911,17 @@
                             <w:rFonts w:ascii="Times New Roman" w:hAnsi="Times New Roman" w:cs="Times New Roman"/>
                             <w:lang w:val="pt-BR"/>
                           </w:rPr>
-                          <w:t xml:space="preserve">SEGMENTO: {SEGMENTO}</w:t>
+                          <w:t xml:space="preserve">SEGMENTO: </w:t>
+                        </w:r>
+                        <w:r>
+                          <w:rPr>
+                            <w:rFonts w:ascii="Tahoma" w:hAnsi="Tahoma" w:cs="Tahoma"/>
+                            <w:b/>
+                            <w:bCs/>
+                            <w:sz w:val="20"/>
+                            <w:szCs w:val="20"/>
+                          </w:rPr>
+                          <w:t>{SEGMENTO}</w:t>
                         </w:r>
                       </w:p>
                       <w:p>
@@ -3141,7 +3435,17 @@
                             <w:rFonts w:ascii="Times New Roman" w:hAnsi="Times New Roman" w:cs="Times New Roman"/>
                             <w:lang w:val="pt-BR"/>
                           </w:rPr>
-                          <w:t xml:space="preserve">NFS-e: {NFSE2}</w:t>
+                          <w:t xml:space="preserve">NFS-e: </w:t>
+                        </w:r>
+                        <w:r>
+                          <w:rPr>
+                            <w:rFonts w:ascii="Tahoma" w:hAnsi="Tahoma" w:cs="Tahoma"/>
+                            <w:b/>
+                            <w:bCs/>
+                            <w:sz w:val="20"/>
+                            <w:szCs w:val="20"/>
+                          </w:rPr>
+                          <w:t>{NFSE2}</w:t>
                         </w:r>
                       </w:p>
                       <w:p>

</xml_diff>

<commit_message>
feat: relatório em PDF via modelo Word + alertas WhatsApp independentes
- Relatório de Informações Cadastrais: preenche o modelo Word (layout
  preservado) e converte para PDF via Gotenberg, com seletor de pasta
- Documentos migrados para Cloudflare R2 + tabela documentos no Supabase
- Worker Cloudflare: alertas WhatsApp por cron (07:50/15:00) com Evolution API
  e rota /converter (proxy DOCX→PDF com CORS)
- Mensagem de prazos: adicionados hoje, vencidos, urgentes, priorizar,
  em andamento (com próximo passo) e concluídos recentes

Co-Authored-By: Claude Opus 4.8 <noreply@anthropic.com>
</commit_message>
<xml_diff>
--- a/public/relatorio_template.docx
+++ b/public/relatorio_template.docx
@@ -83,17 +83,7 @@
                                 <w:rPr>
                                   <w:rFonts w:ascii="Times New Roman" w:hAnsi="Times New Roman" w:cs="Times New Roman"/>
                                 </w:rPr>
-                                <w:t xml:space="preserve">CNPJ: </w:t>
-                              </w:r>
-                              <w:r>
-                                <w:rPr>
-                                  <w:rFonts w:ascii="Tahoma" w:hAnsi="Tahoma" w:cs="Tahoma"/>
-                                  <w:b/>
-                                  <w:bCs/>
-                                  <w:sz w:val="20"/>
-                                  <w:szCs w:val="20"/>
-                                </w:rPr>
-                                <w:t>{CNPJ}</w:t>
+                                <w:t>CNPJ:</w:t>
                               </w:r>
                             </w:p>
                             <w:p>
@@ -107,6 +97,17 @@
                                   <w:lang w:val="pt-BR"/>
                                 </w:rPr>
                               </w:pPr>
+                              <w:r>
+                                <w:rPr>
+                                  <w:rFonts w:ascii="Tahoma" w:hAnsi="Tahoma" w:cs="Tahoma"/>
+                                  <w:b/>
+                                  <w:bCs/>
+                                  <w:sz w:val="20"/>
+                                  <w:szCs w:val="20"/>
+                                  <w:lang w:val="pt-BR"/>
+                                </w:rPr>
+                                <w:t xml:space="preserve">{CNPJ}</w:t>
+                              </w:r>
                             </w:p>
                           </w:txbxContent>
                         </wps:txbx>
@@ -153,17 +154,7 @@
                                   <w:rFonts w:ascii="Times New Roman" w:hAnsi="Times New Roman" w:cs="Times New Roman"/>
                                   <w:lang w:val="pt-BR"/>
                                 </w:rPr>
-                                <w:t xml:space="preserve">INSCRIÇÃO MUNICIPAL: </w:t>
-                              </w:r>
-                              <w:r>
-                                <w:rPr>
-                                  <w:rFonts w:ascii="Tahoma" w:hAnsi="Tahoma" w:cs="Tahoma"/>
-                                  <w:b/>
-                                  <w:bCs/>
-                                  <w:sz w:val="20"/>
-                                  <w:szCs w:val="20"/>
-                                </w:rPr>
-                                <w:t>{INSC_MUN}</w:t>
+                                <w:t>INSCRIÇÃO MUNICIPAL:</w:t>
                               </w:r>
                             </w:p>
                             <w:p>
@@ -177,6 +168,17 @@
                                   <w:lang w:val="pt-BR"/>
                                 </w:rPr>
                               </w:pPr>
+                              <w:r>
+                                <w:rPr>
+                                  <w:rFonts w:ascii="Tahoma" w:hAnsi="Tahoma" w:cs="Tahoma"/>
+                                  <w:b/>
+                                  <w:bCs/>
+                                  <w:sz w:val="20"/>
+                                  <w:szCs w:val="20"/>
+                                  <w:lang w:val="pt-BR"/>
+                                </w:rPr>
+                                <w:t xml:space="preserve">{INSC_MUN}</w:t>
+                              </w:r>
                             </w:p>
                           </w:txbxContent>
                         </wps:txbx>
@@ -223,17 +225,7 @@
                                   <w:rFonts w:ascii="Times New Roman" w:hAnsi="Times New Roman" w:cs="Times New Roman"/>
                                   <w:lang w:val="pt-BR"/>
                                 </w:rPr>
-                                <w:t xml:space="preserve">INSCRIÇÃO ESTADUAL: </w:t>
-                              </w:r>
-                              <w:r>
-                                <w:rPr>
-                                  <w:rFonts w:ascii="Tahoma" w:hAnsi="Tahoma" w:cs="Tahoma"/>
-                                  <w:b/>
-                                  <w:bCs/>
-                                  <w:sz w:val="20"/>
-                                  <w:szCs w:val="20"/>
-                                </w:rPr>
-                                <w:t>{INSC_EST}</w:t>
+                                <w:t>INSCRIÇÃO ESTADUAL:</w:t>
                               </w:r>
                             </w:p>
                             <w:p>
@@ -247,6 +239,17 @@
                                   <w:lang w:val="pt-BR"/>
                                 </w:rPr>
                               </w:pPr>
+                              <w:r>
+                                <w:rPr>
+                                  <w:rFonts w:ascii="Tahoma" w:hAnsi="Tahoma" w:cs="Tahoma"/>
+                                  <w:b/>
+                                  <w:bCs/>
+                                  <w:sz w:val="20"/>
+                                  <w:szCs w:val="20"/>
+                                  <w:lang w:val="pt-BR"/>
+                                </w:rPr>
+                                <w:t xml:space="preserve">{INSC_EST}</w:t>
+                              </w:r>
                             </w:p>
                           </w:txbxContent>
                         </wps:txbx>
@@ -300,9 +303,11 @@
                                   <w:rFonts w:ascii="Times New Roman" w:hAnsi="Times New Roman" w:cs="Times New Roman"/>
                                   <w:lang w:val="pt-BR"/>
                                 </w:rPr>
-                                <w:t xml:space="preserve">: </w:t>
-                              </w:r>
-                              <w:r>
+                                <w:t>:</w:t>
+                              </w:r>
+                            </w:p>
+                            <w:p>
+                              <w:pPr>
                                 <w:rPr>
                                   <w:rFonts w:ascii="Tahoma" w:hAnsi="Tahoma" w:cs="Tahoma"/>
                                   <w:b/>
@@ -310,12 +315,10 @@
                                   <w:color w:val="EE0000"/>
                                   <w:sz w:val="20"/>
                                   <w:szCs w:val="20"/>
-                                </w:rPr>
-                                <w:t>{CPF}</w:t>
-                              </w:r>
-                            </w:p>
-                            <w:p>
-                              <w:pPr>
+                                  <w:lang w:val="pt-BR"/>
+                                </w:rPr>
+                              </w:pPr>
+                              <w:r>
                                 <w:rPr>
                                   <w:rFonts w:ascii="Tahoma" w:hAnsi="Tahoma" w:cs="Tahoma"/>
                                   <w:b/>
@@ -325,7 +328,8 @@
                                   <w:szCs w:val="20"/>
                                   <w:lang w:val="pt-BR"/>
                                 </w:rPr>
-                              </w:pPr>
+                                <w:t xml:space="preserve">{CPF}</w:t>
+                              </w:r>
                             </w:p>
                           </w:txbxContent>
                         </wps:txbx>
@@ -379,17 +383,7 @@
                                   <w:rFonts w:ascii="Times New Roman" w:hAnsi="Times New Roman" w:cs="Times New Roman"/>
                                   <w:lang w:val="pt-BR"/>
                                 </w:rPr>
-                                <w:t xml:space="preserve">: </w:t>
-                              </w:r>
-                              <w:r>
-                                <w:rPr>
-                                  <w:rFonts w:ascii="Tahoma" w:hAnsi="Tahoma" w:cs="Tahoma"/>
-                                  <w:b/>
-                                  <w:bCs/>
-                                  <w:sz w:val="20"/>
-                                  <w:szCs w:val="20"/>
-                                </w:rPr>
-                                <w:t>{DONO}</w:t>
+                                <w:t>:</w:t>
                               </w:r>
                             </w:p>
                             <w:p>
@@ -403,6 +397,17 @@
                                   <w:lang w:val="pt-BR"/>
                                 </w:rPr>
                               </w:pPr>
+                              <w:r>
+                                <w:rPr>
+                                  <w:rFonts w:ascii="Tahoma" w:hAnsi="Tahoma" w:cs="Tahoma"/>
+                                  <w:b/>
+                                  <w:bCs/>
+                                  <w:sz w:val="20"/>
+                                  <w:szCs w:val="20"/>
+                                  <w:lang w:val="pt-BR"/>
+                                </w:rPr>
+                                <w:t xml:space="preserve">{DONO}</w:t>
+                              </w:r>
                             </w:p>
                           </w:txbxContent>
                         </wps:txbx>
@@ -449,17 +454,7 @@
                                   <w:rFonts w:ascii="Times New Roman" w:hAnsi="Times New Roman" w:cs="Times New Roman"/>
                                   <w:lang w:val="pt-BR"/>
                                 </w:rPr>
-                                <w:t xml:space="preserve">SÓCIO ADMINISTRADOR: </w:t>
-                              </w:r>
-                              <w:r>
-                                <w:rPr>
-                                  <w:rFonts w:ascii="Tahoma" w:hAnsi="Tahoma" w:cs="Tahoma"/>
-                                  <w:b/>
-                                  <w:bCs/>
-                                  <w:sz w:val="20"/>
-                                  <w:szCs w:val="20"/>
-                                </w:rPr>
-                                <w:t>{SOCIO}</w:t>
+                                <w:t>SÓCIO ADMINISTRADOR:</w:t>
                               </w:r>
                             </w:p>
                             <w:p>
@@ -473,6 +468,17 @@
                                   <w:lang w:val="pt-BR"/>
                                 </w:rPr>
                               </w:pPr>
+                              <w:r>
+                                <w:rPr>
+                                  <w:rFonts w:ascii="Tahoma" w:hAnsi="Tahoma" w:cs="Tahoma"/>
+                                  <w:b/>
+                                  <w:bCs/>
+                                  <w:sz w:val="18"/>
+                                  <w:szCs w:val="18"/>
+                                  <w:lang w:val="pt-BR"/>
+                                </w:rPr>
+                                <w:t xml:space="preserve">{SOCIO}</w:t>
+                              </w:r>
                             </w:p>
                           </w:txbxContent>
                         </wps:txbx>
@@ -526,17 +532,7 @@
                                   <w:rFonts w:ascii="Times New Roman" w:hAnsi="Times New Roman" w:cs="Times New Roman"/>
                                   <w:lang w:val="pt-BR"/>
                                 </w:rPr>
-                                <w:t xml:space="preserve">: </w:t>
-                              </w:r>
-                              <w:r>
-                                <w:rPr>
-                                  <w:rFonts w:ascii="Tahoma" w:hAnsi="Tahoma" w:cs="Tahoma"/>
-                                  <w:b/>
-                                  <w:bCs/>
-                                  <w:sz w:val="20"/>
-                                  <w:szCs w:val="20"/>
-                                </w:rPr>
-                                <w:t>{NIRE}</w:t>
+                                <w:t>:</w:t>
                               </w:r>
                             </w:p>
                             <w:p>
@@ -559,29 +555,7 @@
                                   <w:szCs w:val="20"/>
                                   <w:lang w:val="pt-BR"/>
                                 </w:rPr>
-                                <w:fldChar w:fldCharType="begin"/>
-                              </w:r>
-                              <w:r>
-                                <w:rPr>
-                                  <w:rFonts w:ascii="Tahoma" w:hAnsi="Tahoma" w:cs="Tahoma"/>
-                                  <w:b/>
-                                  <w:bCs/>
-                                  <w:sz w:val="20"/>
-                                  <w:szCs w:val="20"/>
-                                  <w:lang w:val="pt-BR"/>
-                                </w:rPr>
-                                <w:instrText xml:space="preserve"> MERGEFIELD F20 </w:instrText>
-                              </w:r>
-                              <w:r>
-                                <w:rPr>
-                                  <w:rFonts w:ascii="Tahoma" w:hAnsi="Tahoma" w:cs="Tahoma"/>
-                                  <w:b/>
-                                  <w:bCs/>
-                                  <w:sz w:val="20"/>
-                                  <w:szCs w:val="20"/>
-                                  <w:lang w:val="pt-BR"/>
-                                </w:rPr>
-                                <w:fldChar w:fldCharType="end"/>
+                                <w:t xml:space="preserve">{NIRE}</w:t>
                               </w:r>
                             </w:p>
                           </w:txbxContent>
@@ -698,17 +672,7 @@
                                   <w:rFonts w:ascii="Times New Roman" w:hAnsi="Times New Roman" w:cs="Times New Roman"/>
                                   <w:lang w:val="pt-BR"/>
                                 </w:rPr>
-                                <w:t xml:space="preserve">: </w:t>
-                              </w:r>
-                              <w:r>
-                                <w:rPr>
-                                  <w:rFonts w:ascii="Tahoma" w:hAnsi="Tahoma" w:cs="Tahoma"/>
-                                  <w:b/>
-                                  <w:bCs/>
-                                  <w:sz w:val="20"/>
-                                  <w:szCs w:val="20"/>
-                                </w:rPr>
-                                <w:t>{RAZAO}</w:t>
+                                <w:t>:</w:t>
                               </w:r>
                             </w:p>
                             <w:p>
@@ -722,6 +686,17 @@
                                   <w:lang w:val="pt-BR"/>
                                 </w:rPr>
                               </w:pPr>
+                              <w:r>
+                                <w:rPr>
+                                  <w:rFonts w:ascii="Tahoma" w:hAnsi="Tahoma" w:cs="Tahoma"/>
+                                  <w:b/>
+                                  <w:bCs/>
+                                  <w:sz w:val="20"/>
+                                  <w:szCs w:val="20"/>
+                                  <w:lang w:val="pt-BR"/>
+                                </w:rPr>
+                                <w:t xml:space="preserve">{RAZAO}</w:t>
+                              </w:r>
                             </w:p>
                           </w:txbxContent>
                         </wps:txbx>
@@ -772,17 +747,7 @@
                                   <w:szCs w:val="20"/>
                                   <w:lang w:val="pt-BR"/>
                                 </w:rPr>
-                                <w:t xml:space="preserve">MUNICÍPIO / ESTADO: </w:t>
-                              </w:r>
-                              <w:r>
-                                <w:rPr>
-                                  <w:rFonts w:ascii="Tahoma" w:hAnsi="Tahoma" w:cs="Tahoma"/>
-                                  <w:b/>
-                                  <w:bCs/>
-                                  <w:sz w:val="20"/>
-                                  <w:szCs w:val="20"/>
-                                </w:rPr>
-                                <w:t>{MUN_EST}</w:t>
+                                <w:t>MUNICÍPIO / ESTADO:</w:t>
                               </w:r>
                             </w:p>
                             <w:p>
@@ -796,6 +761,17 @@
                                   <w:lang w:val="pt-BR"/>
                                 </w:rPr>
                               </w:pPr>
+                              <w:r>
+                                <w:rPr>
+                                  <w:rFonts w:ascii="Tahoma" w:hAnsi="Tahoma" w:cs="Tahoma"/>
+                                  <w:b/>
+                                  <w:bCs/>
+                                  <w:sz w:val="20"/>
+                                  <w:szCs w:val="20"/>
+                                  <w:lang w:val="pt-BR"/>
+                                </w:rPr>
+                                <w:t xml:space="preserve">{MUN_EST}</w:t>
+                              </w:r>
                             </w:p>
                           </w:txbxContent>
                         </wps:txbx>
@@ -849,17 +825,30 @@
                                   <w:rFonts w:ascii="Times New Roman" w:hAnsi="Times New Roman" w:cs="Times New Roman"/>
                                   <w:lang w:val="pt-BR"/>
                                 </w:rPr>
-                                <w:t xml:space="preserve">: </w:t>
-                              </w:r>
-                              <w:r>
-                                <w:rPr>
-                                  <w:rFonts w:ascii="Tahoma" w:hAnsi="Tahoma" w:cs="Tahoma"/>
+                                <w:t>:</w:t>
+                              </w:r>
+                            </w:p>
+                            <w:p>
+                              <w:pPr>
+                                <w:rPr>
+                                  <w:rFonts w:ascii="Tahoma" w:eastAsia="Times New Roman" w:hAnsi="Tahoma" w:cs="Tahoma"/>
                                   <w:b/>
                                   <w:bCs/>
                                   <w:sz w:val="20"/>
                                   <w:szCs w:val="20"/>
-                                </w:rPr>
-                                <w:t>{ABERTURA}</w:t>
+                                  <w:lang w:val="pt-BR" w:eastAsia="pt-BR"/>
+                                </w:rPr>
+                              </w:pPr>
+                              <w:r>
+                                <w:rPr>
+                                  <w:rFonts w:ascii="Tahoma" w:hAnsi="Tahoma" w:cs="Tahoma"/>
+                                  <w:b/>
+                                  <w:bCs/>
+                                  <w:sz w:val="20"/>
+                                  <w:szCs w:val="20"/>
+                                  <w:lang w:val="pt-BR"/>
+                                </w:rPr>
+                                <w:t xml:space="preserve">{ABERTURA}</w:t>
                               </w:r>
                             </w:p>
                             <w:p>
@@ -923,18 +912,28 @@
                                   <w:szCs w:val="20"/>
                                   <w:lang w:val="pt-BR"/>
                                 </w:rPr>
-                                <w:t xml:space="preserve">CAPITAL SOCIAL: </w:t>
-                              </w:r>
-                              <w:r>
-                                <w:rPr>
-                                  <w:rFonts w:ascii="Tahoma" w:hAnsi="Tahoma" w:cs="Tahoma"/>
-                                  <w:b/>
-                                  <w:bCs/>
-                                  <w:color w:val="EE0000"/>
+                                <w:t>CAPITAL SOCIAL:</w:t>
+                              </w:r>
+                            </w:p>
+                            <w:p>
+                              <w:pPr>
+                                <w:rPr>
+                                  <w:rFonts w:ascii="Tahoma" w:eastAsia="Times New Roman" w:hAnsi="Tahoma" w:cs="Tahoma"/>
+                                  <w:b/>
+                                  <w:bCs/>
                                   <w:sz w:val="20"/>
                                   <w:szCs w:val="20"/>
-                                </w:rPr>
-                                <w:t>{CAPITAL}</w:t>
+                                  <w:lang w:val="pt-BR" w:eastAsia="pt-BR"/>
+                                </w:rPr>
+                              </w:pPr>
+                              <w:r>
+                                <w:rPr>
+                                  <w:rFonts w:ascii="Times New Roman" w:hAnsi="Times New Roman" w:cs="Times New Roman"/>
+                                  <w:b/>
+                                  <w:bCs/>
+                                  <w:lang w:val="pt-BR"/>
+                                </w:rPr>
+                                <w:t xml:space="preserve">{CAPITAL}</w:t>
                               </w:r>
                             </w:p>
                             <w:p>
@@ -988,17 +987,7 @@
                           <w:rPr>
                             <w:rFonts w:ascii="Times New Roman" w:hAnsi="Times New Roman" w:cs="Times New Roman"/>
                           </w:rPr>
-                          <w:t xml:space="preserve">CNPJ: </w:t>
-                        </w:r>
-                        <w:r>
-                          <w:rPr>
-                            <w:rFonts w:ascii="Tahoma" w:hAnsi="Tahoma" w:cs="Tahoma"/>
-                            <w:b/>
-                            <w:bCs/>
-                            <w:sz w:val="20"/>
-                            <w:szCs w:val="20"/>
-                          </w:rPr>
-                          <w:t>{CNPJ}</w:t>
+                          <w:t>CNPJ:</w:t>
                         </w:r>
                       </w:p>
                       <w:p>
@@ -1012,6 +1001,17 @@
                             <w:lang w:val="pt-BR"/>
                           </w:rPr>
                         </w:pPr>
+                        <w:r>
+                          <w:rPr>
+                            <w:rFonts w:ascii="Tahoma" w:hAnsi="Tahoma" w:cs="Tahoma"/>
+                            <w:b/>
+                            <w:bCs/>
+                            <w:sz w:val="20"/>
+                            <w:szCs w:val="20"/>
+                            <w:lang w:val="pt-BR"/>
+                          </w:rPr>
+                          <w:t xml:space="preserve">{CNPJ}</w:t>
+                        </w:r>
                       </w:p>
                     </w:txbxContent>
                   </v:textbox>
@@ -1031,17 +1031,7 @@
                             <w:rFonts w:ascii="Times New Roman" w:hAnsi="Times New Roman" w:cs="Times New Roman"/>
                             <w:lang w:val="pt-BR"/>
                           </w:rPr>
-                          <w:t xml:space="preserve">INSCRIÇÃO MUNICIPAL: </w:t>
-                        </w:r>
-                        <w:r>
-                          <w:rPr>
-                            <w:rFonts w:ascii="Tahoma" w:hAnsi="Tahoma" w:cs="Tahoma"/>
-                            <w:b/>
-                            <w:bCs/>
-                            <w:sz w:val="20"/>
-                            <w:szCs w:val="20"/>
-                          </w:rPr>
-                          <w:t>{INSC_MUN}</w:t>
+                          <w:t>INSCRIÇÃO MUNICIPAL:</w:t>
                         </w:r>
                       </w:p>
                       <w:p>
@@ -1055,6 +1045,17 @@
                             <w:lang w:val="pt-BR"/>
                           </w:rPr>
                         </w:pPr>
+                        <w:r>
+                          <w:rPr>
+                            <w:rFonts w:ascii="Tahoma" w:hAnsi="Tahoma" w:cs="Tahoma"/>
+                            <w:b/>
+                            <w:bCs/>
+                            <w:sz w:val="20"/>
+                            <w:szCs w:val="20"/>
+                            <w:lang w:val="pt-BR"/>
+                          </w:rPr>
+                          <w:t xml:space="preserve">{INSC_MUN}</w:t>
+                        </w:r>
                       </w:p>
                     </w:txbxContent>
                   </v:textbox>
@@ -1074,17 +1075,7 @@
                             <w:rFonts w:ascii="Times New Roman" w:hAnsi="Times New Roman" w:cs="Times New Roman"/>
                             <w:lang w:val="pt-BR"/>
                           </w:rPr>
-                          <w:t xml:space="preserve">INSCRIÇÃO ESTADUAL: </w:t>
-                        </w:r>
-                        <w:r>
-                          <w:rPr>
-                            <w:rFonts w:ascii="Tahoma" w:hAnsi="Tahoma" w:cs="Tahoma"/>
-                            <w:b/>
-                            <w:bCs/>
-                            <w:sz w:val="20"/>
-                            <w:szCs w:val="20"/>
-                          </w:rPr>
-                          <w:t>{INSC_EST}</w:t>
+                          <w:t>INSCRIÇÃO ESTADUAL:</w:t>
                         </w:r>
                       </w:p>
                       <w:p>
@@ -1098,6 +1089,17 @@
                             <w:lang w:val="pt-BR"/>
                           </w:rPr>
                         </w:pPr>
+                        <w:r>
+                          <w:rPr>
+                            <w:rFonts w:ascii="Tahoma" w:hAnsi="Tahoma" w:cs="Tahoma"/>
+                            <w:b/>
+                            <w:bCs/>
+                            <w:sz w:val="20"/>
+                            <w:szCs w:val="20"/>
+                            <w:lang w:val="pt-BR"/>
+                          </w:rPr>
+                          <w:t xml:space="preserve">{INSC_EST}</w:t>
+                        </w:r>
                       </w:p>
                     </w:txbxContent>
                   </v:textbox>
@@ -1124,9 +1126,11 @@
                             <w:rFonts w:ascii="Times New Roman" w:hAnsi="Times New Roman" w:cs="Times New Roman"/>
                             <w:lang w:val="pt-BR"/>
                           </w:rPr>
-                          <w:t xml:space="preserve">: </w:t>
-                        </w:r>
-                        <w:r>
+                          <w:t>:</w:t>
+                        </w:r>
+                      </w:p>
+                      <w:p>
+                        <w:pPr>
                           <w:rPr>
                             <w:rFonts w:ascii="Tahoma" w:hAnsi="Tahoma" w:cs="Tahoma"/>
                             <w:b/>
@@ -1134,12 +1138,10 @@
                             <w:color w:val="EE0000"/>
                             <w:sz w:val="20"/>
                             <w:szCs w:val="20"/>
-                          </w:rPr>
-                          <w:t>{CPF}</w:t>
-                        </w:r>
-                      </w:p>
-                      <w:p>
-                        <w:pPr>
+                            <w:lang w:val="pt-BR"/>
+                          </w:rPr>
+                        </w:pPr>
+                        <w:r>
                           <w:rPr>
                             <w:rFonts w:ascii="Tahoma" w:hAnsi="Tahoma" w:cs="Tahoma"/>
                             <w:b/>
@@ -1149,7 +1151,8 @@
                             <w:szCs w:val="20"/>
                             <w:lang w:val="pt-BR"/>
                           </w:rPr>
-                        </w:pPr>
+                          <w:t xml:space="preserve">{CPF}</w:t>
+                        </w:r>
                       </w:p>
                     </w:txbxContent>
                   </v:textbox>
@@ -1176,17 +1179,7 @@
                             <w:rFonts w:ascii="Times New Roman" w:hAnsi="Times New Roman" w:cs="Times New Roman"/>
                             <w:lang w:val="pt-BR"/>
                           </w:rPr>
-                          <w:t xml:space="preserve">: </w:t>
-                        </w:r>
-                        <w:r>
-                          <w:rPr>
-                            <w:rFonts w:ascii="Tahoma" w:hAnsi="Tahoma" w:cs="Tahoma"/>
-                            <w:b/>
-                            <w:bCs/>
-                            <w:sz w:val="20"/>
-                            <w:szCs w:val="20"/>
-                          </w:rPr>
-                          <w:t>{DONO}</w:t>
+                          <w:t>:</w:t>
                         </w:r>
                       </w:p>
                       <w:p>
@@ -1200,6 +1193,17 @@
                             <w:lang w:val="pt-BR"/>
                           </w:rPr>
                         </w:pPr>
+                        <w:r>
+                          <w:rPr>
+                            <w:rFonts w:ascii="Tahoma" w:hAnsi="Tahoma" w:cs="Tahoma"/>
+                            <w:b/>
+                            <w:bCs/>
+                            <w:sz w:val="20"/>
+                            <w:szCs w:val="20"/>
+                            <w:lang w:val="pt-BR"/>
+                          </w:rPr>
+                          <w:t xml:space="preserve">{DONO}</w:t>
+                        </w:r>
                       </w:p>
                     </w:txbxContent>
                   </v:textbox>
@@ -1219,17 +1223,7 @@
                             <w:rFonts w:ascii="Times New Roman" w:hAnsi="Times New Roman" w:cs="Times New Roman"/>
                             <w:lang w:val="pt-BR"/>
                           </w:rPr>
-                          <w:t xml:space="preserve">SÓCIO ADMINISTRADOR: </w:t>
-                        </w:r>
-                        <w:r>
-                          <w:rPr>
-                            <w:rFonts w:ascii="Tahoma" w:hAnsi="Tahoma" w:cs="Tahoma"/>
-                            <w:b/>
-                            <w:bCs/>
-                            <w:sz w:val="20"/>
-                            <w:szCs w:val="20"/>
-                          </w:rPr>
-                          <w:t>{SOCIO}</w:t>
+                          <w:t>SÓCIO ADMINISTRADOR:</w:t>
                         </w:r>
                       </w:p>
                       <w:p>
@@ -1243,6 +1237,17 @@
                             <w:lang w:val="pt-BR"/>
                           </w:rPr>
                         </w:pPr>
+                        <w:r>
+                          <w:rPr>
+                            <w:rFonts w:ascii="Tahoma" w:hAnsi="Tahoma" w:cs="Tahoma"/>
+                            <w:b/>
+                            <w:bCs/>
+                            <w:sz w:val="18"/>
+                            <w:szCs w:val="18"/>
+                            <w:lang w:val="pt-BR"/>
+                          </w:rPr>
+                          <w:t xml:space="preserve">{SOCIO}</w:t>
+                        </w:r>
                       </w:p>
                     </w:txbxContent>
                   </v:textbox>
@@ -1269,17 +1274,7 @@
                             <w:rFonts w:ascii="Times New Roman" w:hAnsi="Times New Roman" w:cs="Times New Roman"/>
                             <w:lang w:val="pt-BR"/>
                           </w:rPr>
-                          <w:t xml:space="preserve">: </w:t>
-                        </w:r>
-                        <w:r>
-                          <w:rPr>
-                            <w:rFonts w:ascii="Tahoma" w:hAnsi="Tahoma" w:cs="Tahoma"/>
-                            <w:b/>
-                            <w:bCs/>
-                            <w:sz w:val="20"/>
-                            <w:szCs w:val="20"/>
-                          </w:rPr>
-                          <w:t>{NIRE}</w:t>
+                          <w:t>:</w:t>
                         </w:r>
                       </w:p>
                       <w:p>
@@ -1302,29 +1297,7 @@
                             <w:szCs w:val="20"/>
                             <w:lang w:val="pt-BR"/>
                           </w:rPr>
-                          <w:fldChar w:fldCharType="begin"/>
-                        </w:r>
-                        <w:r>
-                          <w:rPr>
-                            <w:rFonts w:ascii="Tahoma" w:hAnsi="Tahoma" w:cs="Tahoma"/>
-                            <w:b/>
-                            <w:bCs/>
-                            <w:sz w:val="20"/>
-                            <w:szCs w:val="20"/>
-                            <w:lang w:val="pt-BR"/>
-                          </w:rPr>
-                          <w:instrText xml:space="preserve"> MERGEFIELD F20 </w:instrText>
-                        </w:r>
-                        <w:r>
-                          <w:rPr>
-                            <w:rFonts w:ascii="Tahoma" w:hAnsi="Tahoma" w:cs="Tahoma"/>
-                            <w:b/>
-                            <w:bCs/>
-                            <w:sz w:val="20"/>
-                            <w:szCs w:val="20"/>
-                            <w:lang w:val="pt-BR"/>
-                          </w:rPr>
-                          <w:fldChar w:fldCharType="end"/>
+                          <w:t xml:space="preserve">{NIRE}</w:t>
                         </w:r>
                       </w:p>
                     </w:txbxContent>
@@ -1387,17 +1360,7 @@
                             <w:rFonts w:ascii="Times New Roman" w:hAnsi="Times New Roman" w:cs="Times New Roman"/>
                             <w:lang w:val="pt-BR"/>
                           </w:rPr>
-                          <w:t xml:space="preserve">: </w:t>
-                        </w:r>
-                        <w:r>
-                          <w:rPr>
-                            <w:rFonts w:ascii="Tahoma" w:hAnsi="Tahoma" w:cs="Tahoma"/>
-                            <w:b/>
-                            <w:bCs/>
-                            <w:sz w:val="20"/>
-                            <w:szCs w:val="20"/>
-                          </w:rPr>
-                          <w:t>{RAZAO}</w:t>
+                          <w:t>:</w:t>
                         </w:r>
                       </w:p>
                       <w:p>
@@ -1411,6 +1374,17 @@
                             <w:lang w:val="pt-BR"/>
                           </w:rPr>
                         </w:pPr>
+                        <w:r>
+                          <w:rPr>
+                            <w:rFonts w:ascii="Tahoma" w:hAnsi="Tahoma" w:cs="Tahoma"/>
+                            <w:b/>
+                            <w:bCs/>
+                            <w:sz w:val="20"/>
+                            <w:szCs w:val="20"/>
+                            <w:lang w:val="pt-BR"/>
+                          </w:rPr>
+                          <w:t xml:space="preserve">{RAZAO}</w:t>
+                        </w:r>
                       </w:p>
                     </w:txbxContent>
                   </v:textbox>
@@ -1434,17 +1408,7 @@
                             <w:szCs w:val="20"/>
                             <w:lang w:val="pt-BR"/>
                           </w:rPr>
-                          <w:t xml:space="preserve">MUNICÍPIO / ESTADO: </w:t>
-                        </w:r>
-                        <w:r>
-                          <w:rPr>
-                            <w:rFonts w:ascii="Tahoma" w:hAnsi="Tahoma" w:cs="Tahoma"/>
-                            <w:b/>
-                            <w:bCs/>
-                            <w:sz w:val="20"/>
-                            <w:szCs w:val="20"/>
-                          </w:rPr>
-                          <w:t>{MUN_EST}</w:t>
+                          <w:t>MUNICÍPIO / ESTADO:</w:t>
                         </w:r>
                       </w:p>
                       <w:p>
@@ -1458,6 +1422,17 @@
                             <w:lang w:val="pt-BR"/>
                           </w:rPr>
                         </w:pPr>
+                        <w:r>
+                          <w:rPr>
+                            <w:rFonts w:ascii="Tahoma" w:hAnsi="Tahoma" w:cs="Tahoma"/>
+                            <w:b/>
+                            <w:bCs/>
+                            <w:sz w:val="20"/>
+                            <w:szCs w:val="20"/>
+                            <w:lang w:val="pt-BR"/>
+                          </w:rPr>
+                          <w:t xml:space="preserve">{MUN_EST}</w:t>
+                        </w:r>
                       </w:p>
                     </w:txbxContent>
                   </v:textbox>
@@ -1484,17 +1459,30 @@
                             <w:rFonts w:ascii="Times New Roman" w:hAnsi="Times New Roman" w:cs="Times New Roman"/>
                             <w:lang w:val="pt-BR"/>
                           </w:rPr>
-                          <w:t xml:space="preserve">: </w:t>
-                        </w:r>
-                        <w:r>
-                          <w:rPr>
-                            <w:rFonts w:ascii="Tahoma" w:hAnsi="Tahoma" w:cs="Tahoma"/>
+                          <w:t>:</w:t>
+                        </w:r>
+                      </w:p>
+                      <w:p>
+                        <w:pPr>
+                          <w:rPr>
+                            <w:rFonts w:ascii="Tahoma" w:eastAsia="Times New Roman" w:hAnsi="Tahoma" w:cs="Tahoma"/>
                             <w:b/>
                             <w:bCs/>
                             <w:sz w:val="20"/>
                             <w:szCs w:val="20"/>
-                          </w:rPr>
-                          <w:t>{ABERTURA}</w:t>
+                            <w:lang w:val="pt-BR" w:eastAsia="pt-BR"/>
+                          </w:rPr>
+                        </w:pPr>
+                        <w:r>
+                          <w:rPr>
+                            <w:rFonts w:ascii="Tahoma" w:hAnsi="Tahoma" w:cs="Tahoma"/>
+                            <w:b/>
+                            <w:bCs/>
+                            <w:sz w:val="20"/>
+                            <w:szCs w:val="20"/>
+                            <w:lang w:val="pt-BR"/>
+                          </w:rPr>
+                          <w:t xml:space="preserve">{ABERTURA}</w:t>
                         </w:r>
                       </w:p>
                       <w:p>
@@ -1531,18 +1519,28 @@
                             <w:szCs w:val="20"/>
                             <w:lang w:val="pt-BR"/>
                           </w:rPr>
-                          <w:t xml:space="preserve">CAPITAL SOCIAL: </w:t>
-                        </w:r>
-                        <w:r>
-                          <w:rPr>
-                            <w:rFonts w:ascii="Tahoma" w:hAnsi="Tahoma" w:cs="Tahoma"/>
-                            <w:b/>
-                            <w:bCs/>
-                            <w:color w:val="EE0000"/>
+                          <w:t>CAPITAL SOCIAL:</w:t>
+                        </w:r>
+                      </w:p>
+                      <w:p>
+                        <w:pPr>
+                          <w:rPr>
+                            <w:rFonts w:ascii="Tahoma" w:eastAsia="Times New Roman" w:hAnsi="Tahoma" w:cs="Tahoma"/>
+                            <w:b/>
+                            <w:bCs/>
                             <w:sz w:val="20"/>
                             <w:szCs w:val="20"/>
-                          </w:rPr>
-                          <w:t>{CAPITAL}</w:t>
+                            <w:lang w:val="pt-BR" w:eastAsia="pt-BR"/>
+                          </w:rPr>
+                        </w:pPr>
+                        <w:r>
+                          <w:rPr>
+                            <w:rFonts w:ascii="Times New Roman" w:hAnsi="Times New Roman" w:cs="Times New Roman"/>
+                            <w:b/>
+                            <w:bCs/>
+                            <w:lang w:val="pt-BR"/>
+                          </w:rPr>
+                          <w:t xml:space="preserve">{CAPITAL}</w:t>
                         </w:r>
                       </w:p>
                       <w:p>
@@ -1763,17 +1761,7 @@
                                   <w:rFonts w:ascii="Times New Roman" w:hAnsi="Times New Roman" w:cs="Times New Roman"/>
                                   <w:lang w:val="pt-BR"/>
                                 </w:rPr>
-                                <w:t xml:space="preserve">: </w:t>
-                              </w:r>
-                              <w:r>
-                                <w:rPr>
-                                  <w:rFonts w:ascii="Tahoma" w:hAnsi="Tahoma" w:cs="Tahoma"/>
-                                  <w:b/>
-                                  <w:bCs/>
-                                  <w:sz w:val="20"/>
-                                  <w:szCs w:val="20"/>
-                                </w:rPr>
-                                <w:t>{NFSE1}</w:t>
+                                <w:t>:</w:t>
                               </w:r>
                             </w:p>
                             <w:p>
@@ -1787,6 +1775,17 @@
                                   <w:lang w:val="pt-BR"/>
                                 </w:rPr>
                               </w:pPr>
+                              <w:r>
+                                <w:rPr>
+                                  <w:rFonts w:ascii="Tahoma" w:hAnsi="Tahoma" w:cs="Tahoma"/>
+                                  <w:b/>
+                                  <w:bCs/>
+                                  <w:sz w:val="20"/>
+                                  <w:szCs w:val="20"/>
+                                  <w:lang w:val="pt-BR"/>
+                                </w:rPr>
+                                <w:t xml:space="preserve">{NFSE1}</w:t>
+                              </w:r>
                             </w:p>
                           </w:txbxContent>
                         </wps:txbx>
@@ -1833,7 +1832,7 @@
                                   <w:rFonts w:ascii="Times New Roman" w:hAnsi="Times New Roman" w:cs="Times New Roman"/>
                                   <w:lang w:val="pt-BR"/>
                                 </w:rPr>
-                                <w:t xml:space="preserve">MUNICÍPIO: {SEN_MUN}</w:t>
+                                <w:t>MUNICÍPIO:</w:t>
                               </w:r>
                             </w:p>
                             <w:p>
@@ -1847,6 +1846,17 @@
                                   <w:lang w:val="pt-BR"/>
                                 </w:rPr>
                               </w:pPr>
+                              <w:r>
+                                <w:rPr>
+                                  <w:rFonts w:ascii="Tahoma" w:hAnsi="Tahoma" w:cs="Tahoma"/>
+                                  <w:b/>
+                                  <w:bCs/>
+                                  <w:sz w:val="20"/>
+                                  <w:szCs w:val="20"/>
+                                  <w:lang w:val="pt-BR"/>
+                                </w:rPr>
+                                <w:t xml:space="preserve">{SEN_MUN}</w:t>
+                              </w:r>
                             </w:p>
                           </w:txbxContent>
                         </wps:txbx>
@@ -1893,17 +1903,7 @@
                                   <w:rFonts w:ascii="Times New Roman" w:hAnsi="Times New Roman" w:cs="Times New Roman"/>
                                   <w:lang w:val="pt-BR"/>
                                 </w:rPr>
-                                <w:t xml:space="preserve">ESTADO: </w:t>
-                              </w:r>
-                              <w:r>
-                                <w:rPr>
-                                  <w:rFonts w:ascii="Tahoma" w:hAnsi="Tahoma" w:cs="Tahoma"/>
-                                  <w:b/>
-                                  <w:bCs/>
-                                  <w:sz w:val="20"/>
-                                  <w:szCs w:val="20"/>
-                                </w:rPr>
-                                <w:t>{SEN_EST}</w:t>
+                                <w:t>ESTADO:</w:t>
                               </w:r>
                             </w:p>
                             <w:p>
@@ -1917,6 +1917,17 @@
                                   <w:lang w:val="pt-BR"/>
                                 </w:rPr>
                               </w:pPr>
+                              <w:r>
+                                <w:rPr>
+                                  <w:rFonts w:ascii="Tahoma" w:hAnsi="Tahoma" w:cs="Tahoma"/>
+                                  <w:b/>
+                                  <w:bCs/>
+                                  <w:sz w:val="20"/>
+                                  <w:szCs w:val="20"/>
+                                  <w:lang w:val="pt-BR"/>
+                                </w:rPr>
+                                <w:t xml:space="preserve">{SEN_EST}</w:t>
+                              </w:r>
                             </w:p>
                           </w:txbxContent>
                         </wps:txbx>
@@ -1963,17 +1974,7 @@
                                   <w:rFonts w:ascii="Times New Roman" w:hAnsi="Times New Roman" w:cs="Times New Roman"/>
                                   <w:lang w:val="pt-BR"/>
                                 </w:rPr>
-                                <w:t xml:space="preserve">SEGMENTO: </w:t>
-                              </w:r>
-                              <w:r>
-                                <w:rPr>
-                                  <w:rFonts w:ascii="Tahoma" w:hAnsi="Tahoma" w:cs="Tahoma"/>
-                                  <w:b/>
-                                  <w:bCs/>
-                                  <w:sz w:val="20"/>
-                                  <w:szCs w:val="20"/>
-                                </w:rPr>
-                                <w:t>{SEGMENTO}</w:t>
+                                <w:t>SEGMENTO:</w:t>
                               </w:r>
                             </w:p>
                             <w:p>
@@ -1987,6 +1988,17 @@
                                   <w:lang w:val="pt-BR"/>
                                 </w:rPr>
                               </w:pPr>
+                              <w:r>
+                                <w:rPr>
+                                  <w:rFonts w:ascii="Tahoma" w:hAnsi="Tahoma" w:cs="Tahoma"/>
+                                  <w:b/>
+                                  <w:bCs/>
+                                  <w:sz w:val="20"/>
+                                  <w:szCs w:val="20"/>
+                                  <w:lang w:val="pt-BR"/>
+                                </w:rPr>
+                                <w:t xml:space="preserve">{SEGMENTO}</w:t>
+                              </w:r>
                             </w:p>
                           </w:txbxContent>
                         </wps:txbx>
@@ -2056,52 +2068,7 @@
                                   <w:szCs w:val="20"/>
                                   <w:lang w:val="pt-BR"/>
                                 </w:rPr>
-                                <w:fldChar w:fldCharType="begin"/>
-                              </w:r>
-                              <w:r>
-                                <w:rPr>
-                                  <w:rFonts w:ascii="Tahoma" w:hAnsi="Tahoma" w:cs="Tahoma"/>
-                                  <w:b/>
-                                  <w:bCs/>
-                                  <w:sz w:val="20"/>
-                                  <w:szCs w:val="20"/>
-                                  <w:lang w:val="pt-BR"/>
-                                </w:rPr>
-                                <w:instrText xml:space="preserve"> MERGEFIELD F12 </w:instrText>
-                              </w:r>
-                              <w:r>
-                                <w:rPr>
-                                  <w:rFonts w:ascii="Tahoma" w:hAnsi="Tahoma" w:cs="Tahoma"/>
-                                  <w:b/>
-                                  <w:bCs/>
-                                  <w:sz w:val="20"/>
-                                  <w:szCs w:val="20"/>
-                                  <w:lang w:val="pt-BR"/>
-                                </w:rPr>
-                                <w:fldChar w:fldCharType="separate"/>
-                              </w:r>
-                              <w:r>
-                                <w:rPr>
-                                  <w:rFonts w:ascii="Tahoma" w:hAnsi="Tahoma" w:cs="Tahoma"/>
-                                  <w:b/>
-                                  <w:bCs/>
-                                  <w:noProof/>
-                                  <w:sz w:val="20"/>
-                                  <w:szCs w:val="20"/>
-                                  <w:lang w:val="pt-BR"/>
-                                </w:rPr>
-                                <w:t>{CUIDADOR}</w:t>
-                              </w:r>
-                              <w:r>
-                                <w:rPr>
-                                  <w:rFonts w:ascii="Tahoma" w:hAnsi="Tahoma" w:cs="Tahoma"/>
-                                  <w:b/>
-                                  <w:bCs/>
-                                  <w:sz w:val="20"/>
-                                  <w:szCs w:val="20"/>
-                                  <w:lang w:val="pt-BR"/>
-                                </w:rPr>
-                                <w:fldChar w:fldCharType="end"/>
+                                <w:t xml:space="preserve">{CUIDADOR}</w:t>
                               </w:r>
                             </w:p>
                           </w:txbxContent>
@@ -2174,43 +2141,7 @@
                                   <w:szCs w:val="20"/>
                                   <w:lang w:val="pt-BR"/>
                                 </w:rPr>
-                                <w:t>{REGIME}</w:t>
-                              </w:r>
-                              <w:r>
-                                <w:rPr>
-                                  <w:rFonts w:ascii="Tahoma" w:hAnsi="Tahoma" w:cs="Tahoma"/>
-                                  <w:b/>
-                                  <w:bCs/>
-                                  <w:color w:val="000000" w:themeColor="text1"/>
-                                  <w:sz w:val="20"/>
-                                  <w:szCs w:val="20"/>
-                                  <w:lang w:val="pt-BR"/>
-                                </w:rPr>
-                                <w:fldChar w:fldCharType="begin"/>
-                              </w:r>
-                              <w:r>
-                                <w:rPr>
-                                  <w:rFonts w:ascii="Tahoma" w:hAnsi="Tahoma" w:cs="Tahoma"/>
-                                  <w:b/>
-                                  <w:bCs/>
-                                  <w:color w:val="000000" w:themeColor="text1"/>
-                                  <w:sz w:val="20"/>
-                                  <w:szCs w:val="20"/>
-                                  <w:lang w:val="pt-BR"/>
-                                </w:rPr>
-                                <w:instrText xml:space="preserve"> MERGEFIELD F14 </w:instrText>
-                              </w:r>
-                              <w:r>
-                                <w:rPr>
-                                  <w:rFonts w:ascii="Tahoma" w:hAnsi="Tahoma" w:cs="Tahoma"/>
-                                  <w:b/>
-                                  <w:bCs/>
-                                  <w:color w:val="000000" w:themeColor="text1"/>
-                                  <w:sz w:val="20"/>
-                                  <w:szCs w:val="20"/>
-                                  <w:lang w:val="pt-BR"/>
-                                </w:rPr>
-                                <w:fldChar w:fldCharType="end"/>
+                                <w:t xml:space="preserve">{REGIME}</w:t>
                               </w:r>
                             </w:p>
                           </w:txbxContent>
@@ -2281,7 +2212,7 @@
                                   <w:szCs w:val="20"/>
                                   <w:lang w:val="pt-BR"/>
                                 </w:rPr>
-                                <w:t>{DOMINIO}</w:t>
+                                <w:t xml:space="preserve">{DOMINIO}</w:t>
                               </w:r>
                             </w:p>
                           </w:txbxContent>
@@ -2361,40 +2292,7 @@
                                   <w:szCs w:val="20"/>
                                   <w:lang w:val="pt-BR"/>
                                 </w:rPr>
-                                <w:t>{PROCURACAO}</w:t>
-                              </w:r>
-                              <w:r>
-                                <w:rPr>
-                                  <w:rFonts w:ascii="Tahoma" w:hAnsi="Tahoma" w:cs="Tahoma"/>
-                                  <w:b/>
-                                  <w:bCs/>
-                                  <w:sz w:val="20"/>
-                                  <w:szCs w:val="20"/>
-                                  <w:lang w:val="pt-BR"/>
-                                </w:rPr>
-                                <w:fldChar w:fldCharType="begin"/>
-                              </w:r>
-                              <w:r>
-                                <w:rPr>
-                                  <w:rFonts w:ascii="Tahoma" w:hAnsi="Tahoma" w:cs="Tahoma"/>
-                                  <w:b/>
-                                  <w:bCs/>
-                                  <w:sz w:val="20"/>
-                                  <w:szCs w:val="20"/>
-                                  <w:lang w:val="pt-BR"/>
-                                </w:rPr>
-                                <w:instrText xml:space="preserve"> MERGEFIELD F25 </w:instrText>
-                              </w:r>
-                              <w:r>
-                                <w:rPr>
-                                  <w:rFonts w:ascii="Tahoma" w:hAnsi="Tahoma" w:cs="Tahoma"/>
-                                  <w:b/>
-                                  <w:bCs/>
-                                  <w:sz w:val="20"/>
-                                  <w:szCs w:val="20"/>
-                                  <w:lang w:val="pt-BR"/>
-                                </w:rPr>
-                                <w:fldChar w:fldCharType="end"/>
+                                <w:t xml:space="preserve">{PROCURACAO}</w:t>
                               </w:r>
                             </w:p>
                           </w:txbxContent>
@@ -2465,34 +2363,7 @@
                                   <w:bCs/>
                                   <w:lang w:val="pt-BR"/>
                                 </w:rPr>
-                                <w:t>{VERI}</w:t>
-                              </w:r>
-                              <w:r>
-                                <w:rPr>
-                                  <w:rFonts w:ascii="Tahoma" w:hAnsi="Tahoma" w:cs="Tahoma"/>
-                                  <w:b/>
-                                  <w:bCs/>
-                                  <w:lang w:val="pt-BR"/>
-                                </w:rPr>
-                                <w:fldChar w:fldCharType="begin"/>
-                              </w:r>
-                              <w:r>
-                                <w:rPr>
-                                  <w:rFonts w:ascii="Tahoma" w:hAnsi="Tahoma" w:cs="Tahoma"/>
-                                  <w:b/>
-                                  <w:bCs/>
-                                  <w:lang w:val="pt-BR"/>
-                                </w:rPr>
-                                <w:instrText xml:space="preserve"> MERGEFIELD F24 </w:instrText>
-                              </w:r>
-                              <w:r>
-                                <w:rPr>
-                                  <w:rFonts w:ascii="Tahoma" w:hAnsi="Tahoma" w:cs="Tahoma"/>
-                                  <w:b/>
-                                  <w:bCs/>
-                                  <w:lang w:val="pt-BR"/>
-                                </w:rPr>
-                                <w:fldChar w:fldCharType="end"/>
+                                <w:t xml:space="preserve">{VERI}</w:t>
                               </w:r>
                             </w:p>
                           </w:txbxContent>
@@ -2579,56 +2450,7 @@
                                   <w:szCs w:val="20"/>
                                   <w:lang w:val="pt-BR"/>
                                 </w:rPr>
-                                <w:fldChar w:fldCharType="begin"/>
-                              </w:r>
-                              <w:r>
-                                <w:rPr>
-                                  <w:rFonts w:ascii="Tahoma" w:hAnsi="Tahoma" w:cs="Tahoma"/>
-                                  <w:b/>
-                                  <w:bCs/>
-                                  <w:color w:val="EE0000"/>
-                                  <w:sz w:val="20"/>
-                                  <w:szCs w:val="20"/>
-                                  <w:lang w:val="pt-BR"/>
-                                </w:rPr>
-                                <w:instrText xml:space="preserve"> MERGEFIELD F7 </w:instrText>
-                              </w:r>
-                              <w:r>
-                                <w:rPr>
-                                  <w:rFonts w:ascii="Tahoma" w:hAnsi="Tahoma" w:cs="Tahoma"/>
-                                  <w:b/>
-                                  <w:bCs/>
-                                  <w:color w:val="EE0000"/>
-                                  <w:sz w:val="20"/>
-                                  <w:szCs w:val="20"/>
-                                  <w:lang w:val="pt-BR"/>
-                                </w:rPr>
-                                <w:fldChar w:fldCharType="separate"/>
-                              </w:r>
-                              <w:r>
-                                <w:rPr>
-                                  <w:rFonts w:ascii="Tahoma" w:hAnsi="Tahoma" w:cs="Tahoma"/>
-                                  <w:b/>
-                                  <w:bCs/>
-                                  <w:noProof/>
-                                  <w:color w:val="EE0000"/>
-                                  <w:sz w:val="20"/>
-                                  <w:szCs w:val="20"/>
-                                  <w:lang w:val="pt-BR"/>
-                                </w:rPr>
-                                <w:t>{GOVBR}</w:t>
-                              </w:r>
-                              <w:r>
-                                <w:rPr>
-                                  <w:rFonts w:ascii="Tahoma" w:hAnsi="Tahoma" w:cs="Tahoma"/>
-                                  <w:b/>
-                                  <w:bCs/>
-                                  <w:color w:val="EE0000"/>
-                                  <w:sz w:val="20"/>
-                                  <w:szCs w:val="20"/>
-                                  <w:lang w:val="pt-BR"/>
-                                </w:rPr>
-                                <w:fldChar w:fldCharType="end"/>
+                                <w:t xml:space="preserve">{GOVBR}</w:t>
                               </w:r>
                             </w:p>
                           </w:txbxContent>
@@ -2676,17 +2498,7 @@
                                   <w:rFonts w:ascii="Times New Roman" w:hAnsi="Times New Roman" w:cs="Times New Roman"/>
                                   <w:lang w:val="pt-BR"/>
                                 </w:rPr>
-                                <w:t xml:space="preserve">NFS-e: </w:t>
-                              </w:r>
-                              <w:r>
-                                <w:rPr>
-                                  <w:rFonts w:ascii="Tahoma" w:hAnsi="Tahoma" w:cs="Tahoma"/>
-                                  <w:b/>
-                                  <w:bCs/>
-                                  <w:sz w:val="20"/>
-                                  <w:szCs w:val="20"/>
-                                </w:rPr>
-                                <w:t>{NFSE2}</w:t>
+                                <w:t>NFS-e:</w:t>
                               </w:r>
                             </w:p>
                             <w:p>
@@ -2700,6 +2512,17 @@
                                   <w:lang w:val="pt-BR"/>
                                 </w:rPr>
                               </w:pPr>
+                              <w:r>
+                                <w:rPr>
+                                  <w:rFonts w:ascii="Tahoma" w:hAnsi="Tahoma" w:cs="Tahoma"/>
+                                  <w:b/>
+                                  <w:bCs/>
+                                  <w:sz w:val="20"/>
+                                  <w:szCs w:val="20"/>
+                                  <w:lang w:val="pt-BR"/>
+                                </w:rPr>
+                                <w:t xml:space="preserve">{NFSE2}</w:t>
+                              </w:r>
                             </w:p>
                           </w:txbxContent>
                         </wps:txbx>
@@ -2792,17 +2615,7 @@
                             <w:rFonts w:ascii="Times New Roman" w:hAnsi="Times New Roman" w:cs="Times New Roman"/>
                             <w:lang w:val="pt-BR"/>
                           </w:rPr>
-                          <w:t xml:space="preserve">: </w:t>
-                        </w:r>
-                        <w:r>
-                          <w:rPr>
-                            <w:rFonts w:ascii="Tahoma" w:hAnsi="Tahoma" w:cs="Tahoma"/>
-                            <w:b/>
-                            <w:bCs/>
-                            <w:sz w:val="20"/>
-                            <w:szCs w:val="20"/>
-                          </w:rPr>
-                          <w:t>{NFSE1}</w:t>
+                          <w:t>:</w:t>
                         </w:r>
                       </w:p>
                       <w:p>
@@ -2816,6 +2629,17 @@
                             <w:lang w:val="pt-BR"/>
                           </w:rPr>
                         </w:pPr>
+                        <w:r>
+                          <w:rPr>
+                            <w:rFonts w:ascii="Tahoma" w:hAnsi="Tahoma" w:cs="Tahoma"/>
+                            <w:b/>
+                            <w:bCs/>
+                            <w:sz w:val="20"/>
+                            <w:szCs w:val="20"/>
+                            <w:lang w:val="pt-BR"/>
+                          </w:rPr>
+                          <w:t xml:space="preserve">{NFSE1}</w:t>
+                        </w:r>
                       </w:p>
                     </w:txbxContent>
                   </v:textbox>
@@ -2835,7 +2659,7 @@
                             <w:rFonts w:ascii="Times New Roman" w:hAnsi="Times New Roman" w:cs="Times New Roman"/>
                             <w:lang w:val="pt-BR"/>
                           </w:rPr>
-                          <w:t xml:space="preserve">MUNICÍPIO: {SEN_MUN}</w:t>
+                          <w:t>MUNICÍPIO:</w:t>
                         </w:r>
                       </w:p>
                       <w:p>
@@ -2849,6 +2673,17 @@
                             <w:lang w:val="pt-BR"/>
                           </w:rPr>
                         </w:pPr>
+                        <w:r>
+                          <w:rPr>
+                            <w:rFonts w:ascii="Tahoma" w:hAnsi="Tahoma" w:cs="Tahoma"/>
+                            <w:b/>
+                            <w:bCs/>
+                            <w:sz w:val="20"/>
+                            <w:szCs w:val="20"/>
+                            <w:lang w:val="pt-BR"/>
+                          </w:rPr>
+                          <w:t xml:space="preserve">{SEN_MUN}</w:t>
+                        </w:r>
                       </w:p>
                     </w:txbxContent>
                   </v:textbox>
@@ -2868,17 +2703,7 @@
                             <w:rFonts w:ascii="Times New Roman" w:hAnsi="Times New Roman" w:cs="Times New Roman"/>
                             <w:lang w:val="pt-BR"/>
                           </w:rPr>
-                          <w:t xml:space="preserve">ESTADO: </w:t>
-                        </w:r>
-                        <w:r>
-                          <w:rPr>
-                            <w:rFonts w:ascii="Tahoma" w:hAnsi="Tahoma" w:cs="Tahoma"/>
-                            <w:b/>
-                            <w:bCs/>
-                            <w:sz w:val="20"/>
-                            <w:szCs w:val="20"/>
-                          </w:rPr>
-                          <w:t>{SEN_EST}</w:t>
+                          <w:t>ESTADO:</w:t>
                         </w:r>
                       </w:p>
                       <w:p>
@@ -2892,6 +2717,17 @@
                             <w:lang w:val="pt-BR"/>
                           </w:rPr>
                         </w:pPr>
+                        <w:r>
+                          <w:rPr>
+                            <w:rFonts w:ascii="Tahoma" w:hAnsi="Tahoma" w:cs="Tahoma"/>
+                            <w:b/>
+                            <w:bCs/>
+                            <w:sz w:val="20"/>
+                            <w:szCs w:val="20"/>
+                            <w:lang w:val="pt-BR"/>
+                          </w:rPr>
+                          <w:t xml:space="preserve">{SEN_EST}</w:t>
+                        </w:r>
                       </w:p>
                     </w:txbxContent>
                   </v:textbox>
@@ -2911,17 +2747,7 @@
                             <w:rFonts w:ascii="Times New Roman" w:hAnsi="Times New Roman" w:cs="Times New Roman"/>
                             <w:lang w:val="pt-BR"/>
                           </w:rPr>
-                          <w:t xml:space="preserve">SEGMENTO: </w:t>
-                        </w:r>
-                        <w:r>
-                          <w:rPr>
-                            <w:rFonts w:ascii="Tahoma" w:hAnsi="Tahoma" w:cs="Tahoma"/>
-                            <w:b/>
-                            <w:bCs/>
-                            <w:sz w:val="20"/>
-                            <w:szCs w:val="20"/>
-                          </w:rPr>
-                          <w:t>{SEGMENTO}</w:t>
+                          <w:t>SEGMENTO:</w:t>
                         </w:r>
                       </w:p>
                       <w:p>
@@ -2935,6 +2761,17 @@
                             <w:lang w:val="pt-BR"/>
                           </w:rPr>
                         </w:pPr>
+                        <w:r>
+                          <w:rPr>
+                            <w:rFonts w:ascii="Tahoma" w:hAnsi="Tahoma" w:cs="Tahoma"/>
+                            <w:b/>
+                            <w:bCs/>
+                            <w:sz w:val="20"/>
+                            <w:szCs w:val="20"/>
+                            <w:lang w:val="pt-BR"/>
+                          </w:rPr>
+                          <w:t xml:space="preserve">{SEGMENTO}</w:t>
+                        </w:r>
                       </w:p>
                     </w:txbxContent>
                   </v:textbox>
@@ -2977,52 +2814,7 @@
                             <w:szCs w:val="20"/>
                             <w:lang w:val="pt-BR"/>
                           </w:rPr>
-                          <w:fldChar w:fldCharType="begin"/>
-                        </w:r>
-                        <w:r>
-                          <w:rPr>
-                            <w:rFonts w:ascii="Tahoma" w:hAnsi="Tahoma" w:cs="Tahoma"/>
-                            <w:b/>
-                            <w:bCs/>
-                            <w:sz w:val="20"/>
-                            <w:szCs w:val="20"/>
-                            <w:lang w:val="pt-BR"/>
-                          </w:rPr>
-                          <w:instrText xml:space="preserve"> MERGEFIELD F12 </w:instrText>
-                        </w:r>
-                        <w:r>
-                          <w:rPr>
-                            <w:rFonts w:ascii="Tahoma" w:hAnsi="Tahoma" w:cs="Tahoma"/>
-                            <w:b/>
-                            <w:bCs/>
-                            <w:sz w:val="20"/>
-                            <w:szCs w:val="20"/>
-                            <w:lang w:val="pt-BR"/>
-                          </w:rPr>
-                          <w:fldChar w:fldCharType="separate"/>
-                        </w:r>
-                        <w:r>
-                          <w:rPr>
-                            <w:rFonts w:ascii="Tahoma" w:hAnsi="Tahoma" w:cs="Tahoma"/>
-                            <w:b/>
-                            <w:bCs/>
-                            <w:noProof/>
-                            <w:sz w:val="20"/>
-                            <w:szCs w:val="20"/>
-                            <w:lang w:val="pt-BR"/>
-                          </w:rPr>
-                          <w:t>{CUIDADOR}</w:t>
-                        </w:r>
-                        <w:r>
-                          <w:rPr>
-                            <w:rFonts w:ascii="Tahoma" w:hAnsi="Tahoma" w:cs="Tahoma"/>
-                            <w:b/>
-                            <w:bCs/>
-                            <w:sz w:val="20"/>
-                            <w:szCs w:val="20"/>
-                            <w:lang w:val="pt-BR"/>
-                          </w:rPr>
-                          <w:fldChar w:fldCharType="end"/>
+                          <w:t xml:space="preserve">{CUIDADOR}</w:t>
                         </w:r>
                       </w:p>
                     </w:txbxContent>
@@ -3068,43 +2860,7 @@
                             <w:szCs w:val="20"/>
                             <w:lang w:val="pt-BR"/>
                           </w:rPr>
-                          <w:t>{REGIME}</w:t>
-                        </w:r>
-                        <w:r>
-                          <w:rPr>
-                            <w:rFonts w:ascii="Tahoma" w:hAnsi="Tahoma" w:cs="Tahoma"/>
-                            <w:b/>
-                            <w:bCs/>
-                            <w:color w:val="000000" w:themeColor="text1"/>
-                            <w:sz w:val="20"/>
-                            <w:szCs w:val="20"/>
-                            <w:lang w:val="pt-BR"/>
-                          </w:rPr>
-                          <w:fldChar w:fldCharType="begin"/>
-                        </w:r>
-                        <w:r>
-                          <w:rPr>
-                            <w:rFonts w:ascii="Tahoma" w:hAnsi="Tahoma" w:cs="Tahoma"/>
-                            <w:b/>
-                            <w:bCs/>
-                            <w:color w:val="000000" w:themeColor="text1"/>
-                            <w:sz w:val="20"/>
-                            <w:szCs w:val="20"/>
-                            <w:lang w:val="pt-BR"/>
-                          </w:rPr>
-                          <w:instrText xml:space="preserve"> MERGEFIELD F14 </w:instrText>
-                        </w:r>
-                        <w:r>
-                          <w:rPr>
-                            <w:rFonts w:ascii="Tahoma" w:hAnsi="Tahoma" w:cs="Tahoma"/>
-                            <w:b/>
-                            <w:bCs/>
-                            <w:color w:val="000000" w:themeColor="text1"/>
-                            <w:sz w:val="20"/>
-                            <w:szCs w:val="20"/>
-                            <w:lang w:val="pt-BR"/>
-                          </w:rPr>
-                          <w:fldChar w:fldCharType="end"/>
+                          <w:t xml:space="preserve">{REGIME}</w:t>
                         </w:r>
                       </w:p>
                     </w:txbxContent>
@@ -3148,7 +2904,7 @@
                             <w:szCs w:val="20"/>
                             <w:lang w:val="pt-BR"/>
                           </w:rPr>
-                          <w:t>{DOMINIO}</w:t>
+                          <w:t xml:space="preserve">{DOMINIO}</w:t>
                         </w:r>
                       </w:p>
                     </w:txbxContent>
@@ -3201,40 +2957,7 @@
                             <w:szCs w:val="20"/>
                             <w:lang w:val="pt-BR"/>
                           </w:rPr>
-                          <w:t>{PROCURACAO}</w:t>
-                        </w:r>
-                        <w:r>
-                          <w:rPr>
-                            <w:rFonts w:ascii="Tahoma" w:hAnsi="Tahoma" w:cs="Tahoma"/>
-                            <w:b/>
-                            <w:bCs/>
-                            <w:sz w:val="20"/>
-                            <w:szCs w:val="20"/>
-                            <w:lang w:val="pt-BR"/>
-                          </w:rPr>
-                          <w:fldChar w:fldCharType="begin"/>
-                        </w:r>
-                        <w:r>
-                          <w:rPr>
-                            <w:rFonts w:ascii="Tahoma" w:hAnsi="Tahoma" w:cs="Tahoma"/>
-                            <w:b/>
-                            <w:bCs/>
-                            <w:sz w:val="20"/>
-                            <w:szCs w:val="20"/>
-                            <w:lang w:val="pt-BR"/>
-                          </w:rPr>
-                          <w:instrText xml:space="preserve"> MERGEFIELD F25 </w:instrText>
-                        </w:r>
-                        <w:r>
-                          <w:rPr>
-                            <w:rFonts w:ascii="Tahoma" w:hAnsi="Tahoma" w:cs="Tahoma"/>
-                            <w:b/>
-                            <w:bCs/>
-                            <w:sz w:val="20"/>
-                            <w:szCs w:val="20"/>
-                            <w:lang w:val="pt-BR"/>
-                          </w:rPr>
-                          <w:fldChar w:fldCharType="end"/>
+                          <w:t xml:space="preserve">{PROCURACAO}</w:t>
                         </w:r>
                       </w:p>
                     </w:txbxContent>
@@ -3278,34 +3001,7 @@
                             <w:bCs/>
                             <w:lang w:val="pt-BR"/>
                           </w:rPr>
-                          <w:t>{VERI}</w:t>
-                        </w:r>
-                        <w:r>
-                          <w:rPr>
-                            <w:rFonts w:ascii="Tahoma" w:hAnsi="Tahoma" w:cs="Tahoma"/>
-                            <w:b/>
-                            <w:bCs/>
-                            <w:lang w:val="pt-BR"/>
-                          </w:rPr>
-                          <w:fldChar w:fldCharType="begin"/>
-                        </w:r>
-                        <w:r>
-                          <w:rPr>
-                            <w:rFonts w:ascii="Tahoma" w:hAnsi="Tahoma" w:cs="Tahoma"/>
-                            <w:b/>
-                            <w:bCs/>
-                            <w:lang w:val="pt-BR"/>
-                          </w:rPr>
-                          <w:instrText xml:space="preserve"> MERGEFIELD F24 </w:instrText>
-                        </w:r>
-                        <w:r>
-                          <w:rPr>
-                            <w:rFonts w:ascii="Tahoma" w:hAnsi="Tahoma" w:cs="Tahoma"/>
-                            <w:b/>
-                            <w:bCs/>
-                            <w:lang w:val="pt-BR"/>
-                          </w:rPr>
-                          <w:fldChar w:fldCharType="end"/>
+                          <w:t xml:space="preserve">{VERI}</w:t>
                         </w:r>
                       </w:p>
                     </w:txbxContent>
@@ -3365,56 +3061,7 @@
                             <w:szCs w:val="20"/>
                             <w:lang w:val="pt-BR"/>
                           </w:rPr>
-                          <w:fldChar w:fldCharType="begin"/>
-                        </w:r>
-                        <w:r>
-                          <w:rPr>
-                            <w:rFonts w:ascii="Tahoma" w:hAnsi="Tahoma" w:cs="Tahoma"/>
-                            <w:b/>
-                            <w:bCs/>
-                            <w:color w:val="EE0000"/>
-                            <w:sz w:val="20"/>
-                            <w:szCs w:val="20"/>
-                            <w:lang w:val="pt-BR"/>
-                          </w:rPr>
-                          <w:instrText xml:space="preserve"> MERGEFIELD F7 </w:instrText>
-                        </w:r>
-                        <w:r>
-                          <w:rPr>
-                            <w:rFonts w:ascii="Tahoma" w:hAnsi="Tahoma" w:cs="Tahoma"/>
-                            <w:b/>
-                            <w:bCs/>
-                            <w:color w:val="EE0000"/>
-                            <w:sz w:val="20"/>
-                            <w:szCs w:val="20"/>
-                            <w:lang w:val="pt-BR"/>
-                          </w:rPr>
-                          <w:fldChar w:fldCharType="separate"/>
-                        </w:r>
-                        <w:r>
-                          <w:rPr>
-                            <w:rFonts w:ascii="Tahoma" w:hAnsi="Tahoma" w:cs="Tahoma"/>
-                            <w:b/>
-                            <w:bCs/>
-                            <w:noProof/>
-                            <w:color w:val="EE0000"/>
-                            <w:sz w:val="20"/>
-                            <w:szCs w:val="20"/>
-                            <w:lang w:val="pt-BR"/>
-                          </w:rPr>
-                          <w:t>{GOVBR}</w:t>
-                        </w:r>
-                        <w:r>
-                          <w:rPr>
-                            <w:rFonts w:ascii="Tahoma" w:hAnsi="Tahoma" w:cs="Tahoma"/>
-                            <w:b/>
-                            <w:bCs/>
-                            <w:color w:val="EE0000"/>
-                            <w:sz w:val="20"/>
-                            <w:szCs w:val="20"/>
-                            <w:lang w:val="pt-BR"/>
-                          </w:rPr>
-                          <w:fldChar w:fldCharType="end"/>
+                          <w:t xml:space="preserve">{GOVBR}</w:t>
                         </w:r>
                       </w:p>
                     </w:txbxContent>
@@ -3435,17 +3082,7 @@
                             <w:rFonts w:ascii="Times New Roman" w:hAnsi="Times New Roman" w:cs="Times New Roman"/>
                             <w:lang w:val="pt-BR"/>
                           </w:rPr>
-                          <w:t xml:space="preserve">NFS-e: </w:t>
-                        </w:r>
-                        <w:r>
-                          <w:rPr>
-                            <w:rFonts w:ascii="Tahoma" w:hAnsi="Tahoma" w:cs="Tahoma"/>
-                            <w:b/>
-                            <w:bCs/>
-                            <w:sz w:val="20"/>
-                            <w:szCs w:val="20"/>
-                          </w:rPr>
-                          <w:t>{NFSE2}</w:t>
+                          <w:t>NFS-e:</w:t>
                         </w:r>
                       </w:p>
                       <w:p>
@@ -3459,6 +3096,17 @@
                             <w:lang w:val="pt-BR"/>
                           </w:rPr>
                         </w:pPr>
+                        <w:r>
+                          <w:rPr>
+                            <w:rFonts w:ascii="Tahoma" w:hAnsi="Tahoma" w:cs="Tahoma"/>
+                            <w:b/>
+                            <w:bCs/>
+                            <w:sz w:val="20"/>
+                            <w:szCs w:val="20"/>
+                            <w:lang w:val="pt-BR"/>
+                          </w:rPr>
+                          <w:t xml:space="preserve">{NFSE2}</w:t>
+                        </w:r>
                       </w:p>
                     </w:txbxContent>
                   </v:textbox>
@@ -3561,18 +3209,7 @@
                                 <w:szCs w:val="20"/>
                                 <w:lang w:val="pt-BR"/>
                               </w:rPr>
-                              <w:t>{CERTIFICADO}</w:t>
-                            </w:r>
-                            <w:r>
-                              <w:rPr>
-                                <w:rFonts w:ascii="Tahoma" w:hAnsi="Tahoma" w:cs="Tahoma"/>
-                                <w:b/>
-                                <w:bCs/>
-                                <w:sz w:val="20"/>
-                                <w:szCs w:val="20"/>
-                                <w:lang w:val="pt-BR"/>
-                              </w:rPr>
-                              <w:t/>
+                              <w:t xml:space="preserve">{CERTIFICADO}</w:t>
                             </w:r>
                           </w:p>
                         </w:txbxContent>
@@ -3636,18 +3273,7 @@
                           <w:szCs w:val="20"/>
                           <w:lang w:val="pt-BR"/>
                         </w:rPr>
-                        <w:t>{CERTIFICADO}</w:t>
-                      </w:r>
-                      <w:r>
-                        <w:rPr>
-                          <w:rFonts w:ascii="Tahoma" w:hAnsi="Tahoma" w:cs="Tahoma"/>
-                          <w:b/>
-                          <w:bCs/>
-                          <w:sz w:val="20"/>
-                          <w:szCs w:val="20"/>
-                          <w:lang w:val="pt-BR"/>
-                        </w:rPr>
-                        <w:t/>
+                        <w:t xml:space="preserve">{CERTIFICADO}</w:t>
                       </w:r>
                     </w:p>
                   </w:txbxContent>
@@ -3739,7 +3365,23 @@
                                   <w:bCs/>
                                   <w:lang w:val="pt-BR"/>
                                 </w:rPr>
-                                <w:t xml:space="preserve">{QUADRO}</w:t>
+                                <w:fldChar w:fldCharType="begin"/>
+                              </w:r>
+                              <w:r>
+                                <w:rPr>
+                                  <w:b/>
+                                  <w:bCs/>
+                                  <w:lang w:val="pt-BR"/>
+                                </w:rPr>
+                                <w:instrText xml:space="preserve"> MERGEFIELD F28 </w:instrText>
+                              </w:r>
+                              <w:r>
+                                <w:rPr>
+                                  <w:b/>
+                                  <w:bCs/>
+                                  <w:lang w:val="pt-BR"/>
+                                </w:rPr>
+                                <w:fldChar w:fldCharType="end"/>
                               </w:r>
                             </w:p>
                             <w:p>
@@ -3932,7 +3574,23 @@
                             <w:bCs/>
                             <w:lang w:val="pt-BR"/>
                           </w:rPr>
-                          <w:t xml:space="preserve">{QUADRO}</w:t>
+                          <w:fldChar w:fldCharType="begin"/>
+                        </w:r>
+                        <w:r>
+                          <w:rPr>
+                            <w:b/>
+                            <w:bCs/>
+                            <w:lang w:val="pt-BR"/>
+                          </w:rPr>
+                          <w:instrText xml:space="preserve"> MERGEFIELD F28 </w:instrText>
+                        </w:r>
+                        <w:r>
+                          <w:rPr>
+                            <w:b/>
+                            <w:bCs/>
+                            <w:lang w:val="pt-BR"/>
+                          </w:rPr>
+                          <w:fldChar w:fldCharType="end"/>
                         </w:r>
                       </w:p>
                       <w:p>
@@ -4248,7 +3906,7 @@
                                   <w:bCs/>
                                   <w:lang w:val="pt-BR"/>
                                 </w:rPr>
-                                <w:t>{PROCESSOS}</w:t>
+                                <w:t xml:space="preserve">{PROCESSOS}</w:t>
                               </w:r>
                             </w:p>
                           </w:txbxContent>
@@ -4346,7 +4004,7 @@
                             <w:bCs/>
                             <w:lang w:val="pt-BR"/>
                           </w:rPr>
-                          <w:t>{PROCESSOS}</w:t>
+                          <w:t xml:space="preserve">{PROCESSOS}</w:t>
                         </w:r>
                       </w:p>
                     </w:txbxContent>

</xml_diff>